<commit_message>
winding number with parameter phase plot done
</commit_message>
<xml_diff>
--- a/result_6.9_vor_test_4b_record.docx
+++ b/result_6.9_vor_test_4b_record.docx
@@ -106,7 +106,7 @@
                     <pic:cNvPicPr/>
                   </pic:nvPicPr>
                   <pic:blipFill>
-                    <a:blip r:embed="rId4"/>
+                    <a:blip r:embed="rId6"/>
                     <a:stretch>
                       <a:fillRect/>
                     </a:stretch>
@@ -171,7 +171,7 @@
                     <pic:cNvPicPr/>
                   </pic:nvPicPr>
                   <pic:blipFill>
-                    <a:blip r:embed="rId5"/>
+                    <a:blip r:embed="rId7"/>
                     <a:stretch>
                       <a:fillRect/>
                     </a:stretch>
@@ -231,7 +231,7 @@
                     <pic:cNvPicPr/>
                   </pic:nvPicPr>
                   <pic:blipFill>
-                    <a:blip r:embed="rId6"/>
+                    <a:blip r:embed="rId8"/>
                     <a:stretch>
                       <a:fillRect/>
                     </a:stretch>
@@ -341,7 +341,7 @@
                     <pic:cNvPicPr/>
                   </pic:nvPicPr>
                   <pic:blipFill>
-                    <a:blip r:embed="rId7"/>
+                    <a:blip r:embed="rId9"/>
                     <a:stretch>
                       <a:fillRect/>
                     </a:stretch>
@@ -411,7 +411,7 @@
                     <pic:cNvPicPr/>
                   </pic:nvPicPr>
                   <pic:blipFill>
-                    <a:blip r:embed="rId8"/>
+                    <a:blip r:embed="rId10"/>
                     <a:stretch>
                       <a:fillRect/>
                     </a:stretch>
@@ -483,7 +483,7 @@
                     <pic:cNvPicPr/>
                   </pic:nvPicPr>
                   <pic:blipFill>
-                    <a:blip r:embed="rId9"/>
+                    <a:blip r:embed="rId11"/>
                     <a:stretch>
                       <a:fillRect/>
                     </a:stretch>
@@ -1322,7 +1322,7 @@
                     <pic:cNvPicPr/>
                   </pic:nvPicPr>
                   <pic:blipFill>
-                    <a:blip r:embed="rId10"/>
+                    <a:blip r:embed="rId12"/>
                     <a:stretch>
                       <a:fillRect/>
                     </a:stretch>
@@ -2078,7 +2078,7 @@
                     <pic:cNvPicPr/>
                   </pic:nvPicPr>
                   <pic:blipFill>
-                    <a:blip r:embed="rId11"/>
+                    <a:blip r:embed="rId13"/>
                     <a:stretch>
                       <a:fillRect/>
                     </a:stretch>
@@ -2839,7 +2839,7 @@
                     <pic:cNvPicPr/>
                   </pic:nvPicPr>
                   <pic:blipFill>
-                    <a:blip r:embed="rId12"/>
+                    <a:blip r:embed="rId14"/>
                     <a:stretch>
                       <a:fillRect/>
                     </a:stretch>
@@ -2932,7 +2932,7 @@
                     <pic:cNvPicPr/>
                   </pic:nvPicPr>
                   <pic:blipFill>
-                    <a:blip r:embed="rId13"/>
+                    <a:blip r:embed="rId15"/>
                     <a:stretch>
                       <a:fillRect/>
                     </a:stretch>
@@ -3020,7 +3020,7 @@
                     <pic:cNvPicPr/>
                   </pic:nvPicPr>
                   <pic:blipFill>
-                    <a:blip r:embed="rId14"/>
+                    <a:blip r:embed="rId16"/>
                     <a:stretch>
                       <a:fillRect/>
                     </a:stretch>
@@ -3064,23 +3064,22 @@
         <w:t>)</w:t>
       </w:r>
       <w:r>
-        <w:t xml:space="preserve">, as 100 for : </w:t>
-      </w:r>
-      <w:r>
-        <w:t>delta_t = (T/11)</w:t>
-      </w:r>
-    </w:p>
-    <w:p>
-      <w:r>
-        <w:t>J_a_resonance = 2*(np.pi/4)/delta_t</w:t>
-      </w:r>
-      <w:r>
-        <w:t xml:space="preserve"> </w:t>
+        <w:t>, as 100 for : delta_t = (T/11)</w:t>
+      </w:r>
+    </w:p>
+    <w:p>
+      <w:r>
+        <w:t xml:space="preserve">J_a_resonance = 2*(np.pi/4)/delta_t </w:t>
       </w:r>
     </w:p>
     <w:p>
       <w:r>
         <w:t>Time dis 100(below)</w:t>
+      </w:r>
+    </w:p>
+    <w:p>
+      <w:r>
+        <w:t xml:space="preserve">The J_a is chosen to be smaller than T/6 is because </w:t>
       </w:r>
     </w:p>
     <w:p>
@@ -3104,7 +3103,7 @@
                     <pic:cNvPicPr/>
                   </pic:nvPicPr>
                   <pic:blipFill>
-                    <a:blip r:embed="rId15"/>
+                    <a:blip r:embed="rId17"/>
                     <a:stretch>
                       <a:fillRect/>
                     </a:stretch>
@@ -3154,7 +3153,7 @@
                     <pic:cNvPicPr/>
                   </pic:nvPicPr>
                   <pic:blipFill>
-                    <a:blip r:embed="rId16"/>
+                    <a:blip r:embed="rId18"/>
                     <a:stretch>
                       <a:fillRect/>
                     </a:stretch>
@@ -3176,18 +3175,13 @@
       </w:r>
     </w:p>
     <w:p>
-      <w:pPr>
+      <w:r>
+        <w:t>E</w:t>
+      </w:r>
+      <w:r>
         <w:rPr>
           <w:rFonts w:hint="eastAsia"/>
         </w:rPr>
-      </w:pPr>
-      <w:r>
-        <w:t>E</w:t>
-      </w:r>
-      <w:r>
-        <w:rPr>
-          <w:rFonts w:hint="eastAsia"/>
-        </w:rPr>
         <w:t>psilon list found by inserting t vor on xy both OBC</w:t>
       </w:r>
     </w:p>
@@ -3198,576 +3192,576 @@
     </w:p>
     <w:p>
       <w:r>
+        <w:lastRenderedPageBreak/>
         <w:t>-0.100341</w:t>
       </w:r>
     </w:p>
     <w:p>
       <w:r>
+        <w:t>0.300827</w:t>
+      </w:r>
+    </w:p>
+    <w:p>
+      <w:r>
+        <w:t>-0.300827</w:t>
+      </w:r>
+    </w:p>
+    <w:p>
+      <w:r>
+        <w:t>2.94895</w:t>
+      </w:r>
+    </w:p>
+    <w:p>
+      <w:r>
+        <w:t>-2.94895</w:t>
+      </w:r>
+    </w:p>
+    <w:p>
+      <w:r>
+        <w:t>-3.1411</w:t>
+      </w:r>
+    </w:p>
+    <w:p>
+      <w:r>
+        <w:t>3.1411</w:t>
+      </w:r>
+    </w:p>
+    <w:p>
+      <w:r>
+        <w:t>2.75599</w:t>
+      </w:r>
+    </w:p>
+    <w:p>
+      <w:r>
+        <w:t>-2.75599</w:t>
+      </w:r>
+    </w:p>
+    <w:p>
+      <w:r>
+        <w:t>-2.36995</w:t>
+      </w:r>
+    </w:p>
+    <w:p>
+      <w:r>
+        <w:t>-0.500634</w:t>
+      </w:r>
+    </w:p>
+    <w:p>
+      <w:r>
+        <w:t>0.500634</w:t>
+      </w:r>
+    </w:p>
+    <w:p>
+      <w:r>
+        <w:t>-2.56274</w:t>
+      </w:r>
+    </w:p>
+    <w:p>
+      <w:r>
+        <w:t>2.56274</w:t>
+      </w:r>
+    </w:p>
+    <w:p>
+      <w:r>
+        <w:t>0.698958</w:t>
+      </w:r>
+    </w:p>
+    <w:p>
+      <w:r>
+        <w:t>-0.698958</w:t>
+      </w:r>
+    </w:p>
+    <w:p>
+      <w:r>
+        <w:t>2.36995</w:t>
+      </w:r>
+    </w:p>
+    <w:p>
+      <w:r>
+        <w:t>0.894158</w:t>
+      </w:r>
+    </w:p>
+    <w:p>
+      <w:r>
+        <w:t>-0.894158</w:t>
+      </w:r>
+    </w:p>
+    <w:p>
+      <w:r>
+        <w:t>2.1799</w:t>
+      </w:r>
+    </w:p>
+    <w:p>
+      <w:r>
+        <w:t>-2.1799</w:t>
+      </w:r>
+    </w:p>
+    <w:p>
+      <w:r>
+        <w:t>-1.08185</w:t>
+      </w:r>
+    </w:p>
+    <w:p>
+      <w:r>
+        <w:t>1.08185</w:t>
+      </w:r>
+    </w:p>
+    <w:p>
+      <w:r>
+        <w:t>-2.00011</w:t>
+      </w:r>
+    </w:p>
+    <w:p>
+      <w:r>
+        <w:t>2.00011</w:t>
+      </w:r>
+    </w:p>
+    <w:p>
+      <w:r>
+        <w:t>-1.24043</w:t>
+      </w:r>
+    </w:p>
+    <w:p>
+      <w:r>
+        <w:t>-1.23945</w:t>
+      </w:r>
+    </w:p>
+    <w:p>
+      <w:r>
+        <w:t>-1.25671</w:t>
+      </w:r>
+    </w:p>
+    <w:p>
+      <w:r>
         <w:lastRenderedPageBreak/>
-        <w:t>0.300827</w:t>
-      </w:r>
-    </w:p>
-    <w:p>
-      <w:r>
-        <w:t>-0.300827</w:t>
-      </w:r>
-    </w:p>
-    <w:p>
-      <w:r>
-        <w:t>2.94895</w:t>
-      </w:r>
-    </w:p>
-    <w:p>
-      <w:r>
-        <w:t>-2.94895</w:t>
-      </w:r>
-    </w:p>
-    <w:p>
-      <w:r>
-        <w:t>-3.1411</w:t>
-      </w:r>
-    </w:p>
-    <w:p>
-      <w:r>
-        <w:t>3.1411</w:t>
-      </w:r>
-    </w:p>
-    <w:p>
-      <w:r>
-        <w:t>2.75599</w:t>
-      </w:r>
-    </w:p>
-    <w:p>
-      <w:r>
-        <w:t>-2.75599</w:t>
-      </w:r>
-    </w:p>
-    <w:p>
-      <w:r>
-        <w:t>-2.36995</w:t>
-      </w:r>
-    </w:p>
-    <w:p>
-      <w:r>
-        <w:t>-0.500634</w:t>
-      </w:r>
-    </w:p>
-    <w:p>
-      <w:r>
-        <w:t>0.500634</w:t>
-      </w:r>
-    </w:p>
-    <w:p>
-      <w:r>
-        <w:t>-2.56274</w:t>
-      </w:r>
-    </w:p>
-    <w:p>
-      <w:r>
-        <w:t>2.56274</w:t>
-      </w:r>
-    </w:p>
-    <w:p>
-      <w:r>
-        <w:t>0.698958</w:t>
-      </w:r>
-    </w:p>
-    <w:p>
-      <w:r>
-        <w:t>-0.698958</w:t>
-      </w:r>
-    </w:p>
-    <w:p>
-      <w:r>
-        <w:t>2.36995</w:t>
-      </w:r>
-    </w:p>
-    <w:p>
-      <w:r>
-        <w:t>0.894158</w:t>
-      </w:r>
-    </w:p>
-    <w:p>
-      <w:r>
-        <w:t>-0.894158</w:t>
-      </w:r>
-    </w:p>
-    <w:p>
-      <w:r>
-        <w:t>2.1799</w:t>
-      </w:r>
-    </w:p>
-    <w:p>
-      <w:r>
-        <w:t>-2.1799</w:t>
-      </w:r>
-    </w:p>
-    <w:p>
-      <w:r>
-        <w:t>-1.08185</w:t>
-      </w:r>
-    </w:p>
-    <w:p>
-      <w:r>
-        <w:t>1.08185</w:t>
-      </w:r>
-    </w:p>
-    <w:p>
-      <w:r>
-        <w:t>-2.00011</w:t>
-      </w:r>
-    </w:p>
-    <w:p>
-      <w:r>
-        <w:t>2.00011</w:t>
-      </w:r>
-    </w:p>
-    <w:p>
-      <w:r>
-        <w:t>-1.24043</w:t>
-      </w:r>
-    </w:p>
-    <w:p>
-      <w:r>
-        <w:t>-1.23945</w:t>
-      </w:r>
-    </w:p>
-    <w:p>
-      <w:r>
-        <w:t>-1.25671</w:t>
-      </w:r>
-    </w:p>
-    <w:p>
-      <w:r>
         <w:t>1.24043</w:t>
       </w:r>
     </w:p>
     <w:p>
       <w:r>
+        <w:t>1.23945</w:t>
+      </w:r>
+    </w:p>
+    <w:p>
+      <w:r>
+        <w:t>1.25671</w:t>
+      </w:r>
+    </w:p>
+    <w:p>
+      <w:r>
+        <w:t>-1.88969</w:t>
+      </w:r>
+    </w:p>
+    <w:p>
+      <w:r>
+        <w:t>-1.27564</w:t>
+      </w:r>
+    </w:p>
+    <w:p>
+      <w:r>
+        <w:t>1.88969</w:t>
+      </w:r>
+    </w:p>
+    <w:p>
+      <w:r>
+        <w:t>1.27564</w:t>
+      </w:r>
+    </w:p>
+    <w:p>
+      <w:r>
+        <w:t>1.88175</w:t>
+      </w:r>
+    </w:p>
+    <w:p>
+      <w:r>
+        <w:t>-1.88175</w:t>
+      </w:r>
+    </w:p>
+    <w:p>
+      <w:r>
+        <w:t>-1.28441</w:t>
+      </w:r>
+    </w:p>
+    <w:p>
+      <w:r>
+        <w:t>1.28441</w:t>
+      </w:r>
+    </w:p>
+    <w:p>
+      <w:r>
+        <w:t>-1.29547</w:t>
+      </w:r>
+    </w:p>
+    <w:p>
+      <w:r>
+        <w:t>-1.29931</w:t>
+      </w:r>
+    </w:p>
+    <w:p>
+      <w:r>
+        <w:t>-1.87144</w:t>
+      </w:r>
+    </w:p>
+    <w:p>
+      <w:r>
+        <w:t>1.87144</w:t>
+      </w:r>
+    </w:p>
+    <w:p>
+      <w:r>
+        <w:t>1.29547</w:t>
+      </w:r>
+    </w:p>
+    <w:p>
+      <w:r>
+        <w:t>1.29931</w:t>
+      </w:r>
+    </w:p>
+    <w:p>
+      <w:r>
+        <w:t>1.85829</w:t>
+      </w:r>
+    </w:p>
+    <w:p>
+      <w:r>
+        <w:t>-1.85829</w:t>
+      </w:r>
+    </w:p>
+    <w:p>
+      <w:r>
+        <w:t>1.3271</w:t>
+      </w:r>
+    </w:p>
+    <w:p>
+      <w:r>
+        <w:t>-1.3271</w:t>
+      </w:r>
+    </w:p>
+    <w:p>
+      <w:r>
+        <w:t>1.33128</w:t>
+      </w:r>
+    </w:p>
+    <w:p>
+      <w:r>
+        <w:t>-1.33128</w:t>
+      </w:r>
+    </w:p>
+    <w:p>
+      <w:r>
+        <w:t>1.34464</w:t>
+      </w:r>
+    </w:p>
+    <w:p>
+      <w:r>
+        <w:t>-1.34464</w:t>
+      </w:r>
+    </w:p>
+    <w:p>
+      <w:r>
+        <w:t>1.83213</w:t>
+      </w:r>
+    </w:p>
+    <w:p>
+      <w:r>
+        <w:t>-1.83213</w:t>
+      </w:r>
+    </w:p>
+    <w:p>
+      <w:r>
+        <w:t>-1.3729</w:t>
+      </w:r>
+    </w:p>
+    <w:p>
+      <w:r>
         <w:lastRenderedPageBreak/>
-        <w:t>1.23945</w:t>
-      </w:r>
-    </w:p>
-    <w:p>
-      <w:r>
-        <w:t>1.25671</w:t>
-      </w:r>
-    </w:p>
-    <w:p>
-      <w:r>
-        <w:t>-1.88969</w:t>
-      </w:r>
-    </w:p>
-    <w:p>
-      <w:r>
-        <w:t>-1.27564</w:t>
-      </w:r>
-    </w:p>
-    <w:p>
-      <w:r>
-        <w:t>1.88969</w:t>
-      </w:r>
-    </w:p>
-    <w:p>
-      <w:r>
-        <w:t>1.27564</w:t>
-      </w:r>
-    </w:p>
-    <w:p>
-      <w:r>
-        <w:t>1.88175</w:t>
-      </w:r>
-    </w:p>
-    <w:p>
-      <w:r>
-        <w:t>-1.88175</w:t>
-      </w:r>
-    </w:p>
-    <w:p>
-      <w:r>
-        <w:t>-1.28441</w:t>
-      </w:r>
-    </w:p>
-    <w:p>
-      <w:r>
-        <w:t>1.28441</w:t>
-      </w:r>
-    </w:p>
-    <w:p>
-      <w:r>
-        <w:t>-1.29547</w:t>
-      </w:r>
-    </w:p>
-    <w:p>
-      <w:r>
-        <w:t>-1.29931</w:t>
-      </w:r>
-    </w:p>
-    <w:p>
-      <w:r>
-        <w:t>-1.87144</w:t>
-      </w:r>
-    </w:p>
-    <w:p>
-      <w:r>
-        <w:t>1.87144</w:t>
-      </w:r>
-    </w:p>
-    <w:p>
-      <w:r>
-        <w:t>1.29547</w:t>
-      </w:r>
-    </w:p>
-    <w:p>
-      <w:r>
-        <w:t>1.29931</w:t>
-      </w:r>
-    </w:p>
-    <w:p>
-      <w:r>
-        <w:t>1.85829</w:t>
-      </w:r>
-    </w:p>
-    <w:p>
-      <w:r>
-        <w:t>-1.85829</w:t>
-      </w:r>
-    </w:p>
-    <w:p>
-      <w:r>
-        <w:t>1.3271</w:t>
-      </w:r>
-    </w:p>
-    <w:p>
-      <w:r>
-        <w:t>-1.3271</w:t>
-      </w:r>
-    </w:p>
-    <w:p>
-      <w:r>
-        <w:t>1.33128</w:t>
-      </w:r>
-    </w:p>
-    <w:p>
-      <w:r>
-        <w:t>-1.33128</w:t>
-      </w:r>
-    </w:p>
-    <w:p>
-      <w:r>
-        <w:t>1.34464</w:t>
-      </w:r>
-    </w:p>
-    <w:p>
-      <w:r>
-        <w:t>-1.34464</w:t>
-      </w:r>
-    </w:p>
-    <w:p>
-      <w:r>
-        <w:t>1.83213</w:t>
-      </w:r>
-    </w:p>
-    <w:p>
-      <w:r>
-        <w:t>-1.83213</w:t>
-      </w:r>
-    </w:p>
-    <w:p>
-      <w:r>
-        <w:t>-1.3729</w:t>
-      </w:r>
-    </w:p>
-    <w:p>
-      <w:r>
         <w:t>1.3729</w:t>
       </w:r>
     </w:p>
     <w:p>
       <w:r>
+        <w:t>-1.39409</w:t>
+      </w:r>
+    </w:p>
+    <w:p>
+      <w:r>
+        <w:t>1.39409</w:t>
+      </w:r>
+    </w:p>
+    <w:p>
+      <w:r>
+        <w:t>-1.80325</w:t>
+      </w:r>
+    </w:p>
+    <w:p>
+      <w:r>
+        <w:t>-1.79601</w:t>
+      </w:r>
+    </w:p>
+    <w:p>
+      <w:r>
+        <w:t>1.80325</w:t>
+      </w:r>
+    </w:p>
+    <w:p>
+      <w:r>
+        <w:t>1.79601</w:t>
+      </w:r>
+    </w:p>
+    <w:p>
+      <w:r>
+        <w:t>-1.41094</w:t>
+      </w:r>
+    </w:p>
+    <w:p>
+      <w:r>
+        <w:t>1.41094</w:t>
+      </w:r>
+    </w:p>
+    <w:p>
+      <w:r>
+        <w:t>-1.77829</w:t>
+      </w:r>
+    </w:p>
+    <w:p>
+      <w:r>
+        <w:t>1.77829</w:t>
+      </w:r>
+    </w:p>
+    <w:p>
+      <w:r>
+        <w:t>1.42959</w:t>
+      </w:r>
+    </w:p>
+    <w:p>
+      <w:r>
+        <w:t>1.77161</w:t>
+      </w:r>
+    </w:p>
+    <w:p>
+      <w:r>
+        <w:t>-1.42959</w:t>
+      </w:r>
+    </w:p>
+    <w:p>
+      <w:r>
+        <w:t>-1.77161</w:t>
+      </w:r>
+    </w:p>
+    <w:p>
+      <w:r>
+        <w:t>-1.45274</w:t>
+      </w:r>
+    </w:p>
+    <w:p>
+      <w:r>
+        <w:t>-1.75442</w:t>
+      </w:r>
+    </w:p>
+    <w:p>
+      <w:r>
+        <w:t>-1.75084</w:t>
+      </w:r>
+    </w:p>
+    <w:p>
+      <w:r>
+        <w:t>1.45274</w:t>
+      </w:r>
+    </w:p>
+    <w:p>
+      <w:r>
+        <w:t>1.75442</w:t>
+      </w:r>
+    </w:p>
+    <w:p>
+      <w:r>
+        <w:t>1.75084</w:t>
+      </w:r>
+    </w:p>
+    <w:p>
+      <w:r>
+        <w:t>1.73645</w:t>
+      </w:r>
+    </w:p>
+    <w:p>
+      <w:r>
+        <w:t>1.46937</w:t>
+      </w:r>
+    </w:p>
+    <w:p>
+      <w:r>
+        <w:t>1.73353</w:t>
+      </w:r>
+    </w:p>
+    <w:p>
+      <w:r>
+        <w:t>-1.46937</w:t>
+      </w:r>
+    </w:p>
+    <w:p>
+      <w:r>
+        <w:t>-1.73645</w:t>
+      </w:r>
+    </w:p>
+    <w:p>
+      <w:r>
+        <w:t>-1.73353</w:t>
+      </w:r>
+    </w:p>
+    <w:p>
+      <w:r>
+        <w:t>1.70516</w:t>
+      </w:r>
+    </w:p>
+    <w:p>
+      <w:r>
         <w:lastRenderedPageBreak/>
-        <w:t>-1.39409</w:t>
-      </w:r>
-    </w:p>
-    <w:p>
-      <w:r>
-        <w:t>1.39409</w:t>
-      </w:r>
-    </w:p>
-    <w:p>
-      <w:r>
-        <w:t>-1.80325</w:t>
-      </w:r>
-    </w:p>
-    <w:p>
-      <w:r>
-        <w:t>-1.79601</w:t>
-      </w:r>
-    </w:p>
-    <w:p>
-      <w:r>
-        <w:t>1.80325</w:t>
-      </w:r>
-    </w:p>
-    <w:p>
-      <w:r>
-        <w:t>1.79601</w:t>
-      </w:r>
-    </w:p>
-    <w:p>
-      <w:r>
-        <w:t>-1.41094</w:t>
-      </w:r>
-    </w:p>
-    <w:p>
-      <w:r>
-        <w:t>1.41094</w:t>
-      </w:r>
-    </w:p>
-    <w:p>
-      <w:r>
-        <w:t>-1.77829</w:t>
-      </w:r>
-    </w:p>
-    <w:p>
-      <w:r>
-        <w:t>1.77829</w:t>
-      </w:r>
-    </w:p>
-    <w:p>
-      <w:r>
-        <w:t>1.42959</w:t>
-      </w:r>
-    </w:p>
-    <w:p>
-      <w:r>
-        <w:t>1.77161</w:t>
-      </w:r>
-    </w:p>
-    <w:p>
-      <w:r>
-        <w:t>-1.42959</w:t>
-      </w:r>
-    </w:p>
-    <w:p>
-      <w:r>
-        <w:t>-1.77161</w:t>
-      </w:r>
-    </w:p>
-    <w:p>
-      <w:r>
-        <w:t>-1.45274</w:t>
-      </w:r>
-    </w:p>
-    <w:p>
-      <w:r>
-        <w:t>-1.75442</w:t>
-      </w:r>
-    </w:p>
-    <w:p>
-      <w:r>
-        <w:t>-1.75084</w:t>
-      </w:r>
-    </w:p>
-    <w:p>
-      <w:r>
-        <w:t>1.45274</w:t>
-      </w:r>
-    </w:p>
-    <w:p>
-      <w:r>
-        <w:t>1.75442</w:t>
-      </w:r>
-    </w:p>
-    <w:p>
-      <w:r>
-        <w:t>1.75084</w:t>
-      </w:r>
-    </w:p>
-    <w:p>
-      <w:r>
-        <w:t>1.73645</w:t>
-      </w:r>
-    </w:p>
-    <w:p>
-      <w:r>
-        <w:t>1.46937</w:t>
-      </w:r>
-    </w:p>
-    <w:p>
-      <w:r>
-        <w:t>1.73353</w:t>
-      </w:r>
-    </w:p>
-    <w:p>
-      <w:r>
-        <w:t>-1.46937</w:t>
-      </w:r>
-    </w:p>
-    <w:p>
-      <w:r>
-        <w:t>-1.73645</w:t>
-      </w:r>
-    </w:p>
-    <w:p>
-      <w:r>
-        <w:t>-1.73353</w:t>
-      </w:r>
-    </w:p>
-    <w:p>
-      <w:r>
-        <w:t>1.70516</w:t>
-      </w:r>
-    </w:p>
-    <w:p>
-      <w:r>
         <w:t>-1.70516</w:t>
       </w:r>
     </w:p>
     <w:p>
       <w:r>
+        <w:t>-1.67564</w:t>
+      </w:r>
+    </w:p>
+    <w:p>
+      <w:r>
+        <w:t>1.67564</w:t>
+      </w:r>
+    </w:p>
+    <w:p>
+      <w:r>
+        <w:t>-1.48731</w:t>
+      </w:r>
+    </w:p>
+    <w:p>
+      <w:r>
+        <w:t>1.48731</w:t>
+      </w:r>
+    </w:p>
+    <w:p>
+      <w:r>
+        <w:t>1.71681</w:t>
+      </w:r>
+    </w:p>
+    <w:p>
+      <w:r>
+        <w:t>1.66432</w:t>
+      </w:r>
+    </w:p>
+    <w:p>
+      <w:r>
+        <w:t>-1.66432</w:t>
+      </w:r>
+    </w:p>
+    <w:p>
+      <w:r>
+        <w:t>-1.71681</w:t>
+      </w:r>
+    </w:p>
+    <w:p>
+      <w:r>
+        <w:t>1.65793</w:t>
+      </w:r>
+    </w:p>
+    <w:p>
+      <w:r>
+        <w:t>-1.65793</w:t>
+      </w:r>
+    </w:p>
+    <w:p>
+      <w:r>
+        <w:t>1.50181</w:t>
+      </w:r>
+    </w:p>
+    <w:p>
+      <w:r>
+        <w:t>-1.50181</w:t>
+      </w:r>
+    </w:p>
+    <w:p>
+      <w:r>
+        <w:t>-1.63855</w:t>
+      </w:r>
+    </w:p>
+    <w:p>
+      <w:r>
+        <w:t>-1.50999</w:t>
+      </w:r>
+    </w:p>
+    <w:p>
+      <w:r>
+        <w:t>1.63855</w:t>
+      </w:r>
+    </w:p>
+    <w:p>
+      <w:r>
+        <w:t>1.50999</w:t>
+      </w:r>
+    </w:p>
+    <w:p>
+      <w:r>
+        <w:t>1.61636</w:t>
+      </w:r>
+    </w:p>
+    <w:p>
+      <w:r>
+        <w:t>-1.61636</w:t>
+      </w:r>
+    </w:p>
+    <w:p>
+      <w:r>
+        <w:t>1.59506</w:t>
+      </w:r>
+    </w:p>
+    <w:p>
+      <w:r>
+        <w:t>-1.59506</w:t>
+      </w:r>
+    </w:p>
+    <w:p>
+      <w:r>
+        <w:t>-1.58927</w:t>
+      </w:r>
+    </w:p>
+    <w:p>
+      <w:r>
+        <w:t>1.58927</w:t>
+      </w:r>
+    </w:p>
+    <w:p>
+      <w:r>
+        <w:t>1.51646</w:t>
+      </w:r>
+    </w:p>
+    <w:p>
+      <w:r>
+        <w:t>-1.51646</w:t>
+      </w:r>
+    </w:p>
+    <w:p>
+      <w:r>
+        <w:t>1.57327</w:t>
+      </w:r>
+    </w:p>
+    <w:p>
+      <w:r>
+        <w:t>-1.57327</w:t>
+      </w:r>
+    </w:p>
+    <w:p>
+      <w:r>
+        <w:t>1.56853</w:t>
+      </w:r>
+    </w:p>
+    <w:p>
+      <w:r>
         <w:lastRenderedPageBreak/>
-        <w:t>-1.67564</w:t>
-      </w:r>
-    </w:p>
-    <w:p>
-      <w:r>
-        <w:t>1.67564</w:t>
-      </w:r>
-    </w:p>
-    <w:p>
-      <w:r>
-        <w:t>-1.48731</w:t>
-      </w:r>
-    </w:p>
-    <w:p>
-      <w:r>
-        <w:t>1.48731</w:t>
-      </w:r>
-    </w:p>
-    <w:p>
-      <w:r>
-        <w:t>1.71681</w:t>
-      </w:r>
-    </w:p>
-    <w:p>
-      <w:r>
-        <w:t>1.66432</w:t>
-      </w:r>
-    </w:p>
-    <w:p>
-      <w:r>
-        <w:t>-1.66432</w:t>
-      </w:r>
-    </w:p>
-    <w:p>
-      <w:r>
-        <w:t>-1.71681</w:t>
-      </w:r>
-    </w:p>
-    <w:p>
-      <w:r>
-        <w:t>1.65793</w:t>
-      </w:r>
-    </w:p>
-    <w:p>
-      <w:r>
-        <w:t>-1.65793</w:t>
-      </w:r>
-    </w:p>
-    <w:p>
-      <w:r>
-        <w:t>1.50181</w:t>
-      </w:r>
-    </w:p>
-    <w:p>
-      <w:r>
-        <w:t>-1.50181</w:t>
-      </w:r>
-    </w:p>
-    <w:p>
-      <w:r>
-        <w:t>-1.63855</w:t>
-      </w:r>
-    </w:p>
-    <w:p>
-      <w:r>
-        <w:t>-1.50999</w:t>
-      </w:r>
-    </w:p>
-    <w:p>
-      <w:r>
-        <w:t>1.63855</w:t>
-      </w:r>
-    </w:p>
-    <w:p>
-      <w:r>
-        <w:t>1.50999</w:t>
-      </w:r>
-    </w:p>
-    <w:p>
-      <w:r>
-        <w:t>1.61636</w:t>
-      </w:r>
-    </w:p>
-    <w:p>
-      <w:r>
-        <w:t>-1.61636</w:t>
-      </w:r>
-    </w:p>
-    <w:p>
-      <w:r>
-        <w:t>1.59506</w:t>
-      </w:r>
-    </w:p>
-    <w:p>
-      <w:r>
-        <w:t>-1.59506</w:t>
-      </w:r>
-    </w:p>
-    <w:p>
-      <w:r>
-        <w:t>-1.58927</w:t>
-      </w:r>
-    </w:p>
-    <w:p>
-      <w:r>
-        <w:t>1.58927</w:t>
-      </w:r>
-    </w:p>
-    <w:p>
-      <w:r>
-        <w:t>1.51646</w:t>
-      </w:r>
-    </w:p>
-    <w:p>
-      <w:r>
-        <w:t>-1.51646</w:t>
-      </w:r>
-    </w:p>
-    <w:p>
-      <w:r>
-        <w:t>1.57327</w:t>
-      </w:r>
-    </w:p>
-    <w:p>
-      <w:r>
-        <w:t>-1.57327</w:t>
-      </w:r>
-    </w:p>
-    <w:p>
-      <w:r>
-        <w:t>1.56853</w:t>
-      </w:r>
-    </w:p>
-    <w:p>
-      <w:r>
         <w:t>-1.56853</w:t>
       </w:r>
     </w:p>
     <w:p>
       <w:r>
-        <w:lastRenderedPageBreak/>
         <w:t>1.62761</w:t>
       </w:r>
     </w:p>
@@ -3836,6 +3830,7 @@
         <w:t>1.52489</w:t>
       </w:r>
     </w:p>
+    <w:p/>
     <w:p>
       <w:r>
         <w:rPr>
@@ -3858,7 +3853,7 @@
                     <pic:cNvPicPr/>
                   </pic:nvPicPr>
                   <pic:blipFill>
-                    <a:blip r:embed="rId17"/>
+                    <a:blip r:embed="rId19"/>
                     <a:stretch>
                       <a:fillRect/>
                     </a:stretch>
@@ -3881,712 +3876,2180 @@
     </w:p>
     <w:p>
       <w:r>
-        <w:t xml:space="preserve">= 16.00)| | \ U full time vortex core calculation: 33% done; est. time of finish: 08:36:11 (sim. t = 17.00)| | | U full time vortex core calculation: 34% done; est. time of finish: 08:36:42 (sim. t = 18.00)| | / U full time vortex core calculation: 36% done; est. time of finish: 08:36:38 (sim. t = 19.00)| | - U full time vortex core calculation: 38% done; est. time of finish: 08:36:41 (sim. t = 20.00)| | \ U full time vortex core calculation: 40% done; est. time of finish: 08:36:40 (sim. t = 21.00)| | | U full time vortex core calculation: 42% done; est. time of finish: 08:36:40 (sim. t = 22.00)| | / U full time vortex core calculation: 44% done; est. time of finish: 08:36:39 (sim. t = 23.00)| | - U full time vortex core calculation: 46% done; est. time of finish: 08:36:40 (sim. t = 24.00)| | \ U full time vortex core calculation: 48% done; est. time of finish: 08:36:40 (sim. t = 25.00)| | | U full time vortex core calculation: 50% done; est. time of finish: 08:36:38 (sim. t = 26.00)| | / U full time vortex core calculation: 52% done; est. time of finish: 08:36:35 (sim. t = 27.00)| | - U full time vortex core calculation: 54% done; est. time of finish: 08:36:34 (sim. t = 28.00)| | \ U full time vortex core calculation: 56% done; est. time of finish: 08:36:34 (sim. t = 29.00)| | | U full time vortex core calculation: 58% done; est. time of finish: 08:36:29 (sim. t = 30.00)| | / U full time vortex core calculation: 60% done; est. time of finish: 08:36:25 (sim. t = 31.00)| | - U full time vortex core </w:t>
-      </w:r>
+        <w:t>| For offset = 0.01:</w:t>
+      </w:r>
+    </w:p>
+    <w:p>
+      <w:r>
+        <w:t xml:space="preserve">|  Rho table |  Sites          Rho sum         </w:t>
+      </w:r>
+    </w:p>
+    <w:p>
+      <w:r>
+        <w:t>| ------------------------------------------------------</w:t>
+      </w:r>
+    </w:p>
+    <w:p>
+      <w:r>
+        <w:t xml:space="preserve">|      0     | [1 1 1]   0.02168354401091861   </w:t>
+      </w:r>
+    </w:p>
+    <w:p>
+      <w:r>
+        <w:t xml:space="preserve">|      1     | [1 1 2]   0.12585463861464385   </w:t>
+      </w:r>
+    </w:p>
+    <w:p>
+      <w:r>
+        <w:t xml:space="preserve">|      2     | [2 1 1]   0.024930894540970472  </w:t>
+      </w:r>
+    </w:p>
+    <w:p>
+      <w:r>
+        <w:t xml:space="preserve">|      3     | [2 1 2]   0.07910090103551375   </w:t>
+      </w:r>
+    </w:p>
+    <w:p>
+      <w:r>
+        <w:t xml:space="preserve">|      4     | [3 1 1]   0.052745046981654164  </w:t>
+      </w:r>
+    </w:p>
+    <w:p>
+      <w:r>
+        <w:t xml:space="preserve">|      5     | [3 1 2]   0.06695617220656153   </w:t>
+      </w:r>
+    </w:p>
+    <w:p>
+      <w:r>
+        <w:t xml:space="preserve">|      6     | [4 1 1]   0.09127675400621518   </w:t>
+      </w:r>
+    </w:p>
+    <w:p>
+      <w:r>
+        <w:t xml:space="preserve">|      7     | [4 1 2]   0.04003692013423522   </w:t>
+      </w:r>
+    </w:p>
+    <w:p>
+      <w:r>
+        <w:t xml:space="preserve">|      8     | [5 1 1]   0.09210675582827417   </w:t>
+      </w:r>
+    </w:p>
+    <w:p>
       <w:r>
         <w:lastRenderedPageBreak/>
-        <w:t>calculation: 62% done; est. time of finish: 08:36:21 (sim. t = 32.00)| | \ U full time vortex core calculation: 64% done; est. time of finish: 08:36:17 (sim. t = 33.00)| | | U full time vortex core calculation: 66% done; est. time of finish: 08:36:14 (sim. t = 34.00)| | / U full time vortex core calculation: 67% done; est. time of finish: 08:36:32 (sim. t = 35.00)| | - U full time vortex core calculation: 69% done; est. time of finish: 08:36:30 (sim. t = 36.00)| | \ U full time vortex core calculation: 71% done; est. time of finish: 08:36:27 (sim. t = 37.00)| | | U full time vortex core calculation: 73% done; est. time of finish: 08:36:22 (sim. t = 38.00)| | / U full time vortex core calculation: 75% done; est. time of finish: 08:36:23 (sim. t = 39.00)| | - U full time vortex core calculation: 77% done; est. time of finish: 08:36:23 (sim. t = 40.00)| | \ U full time vortex core calculation: 79% done; est. time of finish: 08:36:21 (sim. t = 41.00)| | | U full time vortex core calculation: 81% done; est. time of finish: 08:36:20 (sim. t = 42.00)| | / U full time vortex core calculation: 83% done; est. time of finish: 08:36:19 (sim. t = 43.00)| | - U full time vortex core calculation: 85% done; est. time of finish: 08:36:19 (sim. t = 44.00)| | \ U full time vortex core calculation: 87% done; est. time of finish: 08:35:58 (sim. t = 45.00)| | | U full time vortex core calculation: 89% done; est. time of finish: 08:35:38 (sim. t = 46.00)| | / U full time vortex core calculation: 91% done; est. time of finish: 08:35:20 (sim. t = 47.00)| | - U full time vortex core calculation: 93% done; est. time of finish: 08:35:07 (sim. t = 48.00)| | \ U full time vortex core calculation: 95% done; est. time of finish: 08:34:56 (sim. t = 49.00)</w:t>
-      </w:r>
-    </w:p>
-    <w:p>
-      <w:r>
-        <w:t>| | Diagonalising U_4...</w:t>
-      </w:r>
-    </w:p>
-    <w:p>
-      <w:r>
-        <w:t>| | Building all sites...</w:t>
-      </w:r>
-    </w:p>
-    <w:p>
-      <w:r>
-        <w:t>| | Converting sites to comp indices...</w:t>
-      </w:r>
-    </w:p>
-    <w:p>
-      <w:r>
-        <w:t>| \_</w:t>
+        <w:t xml:space="preserve">|      9     | [5 1 2]  3.8095902544840385e-05 </w:t>
+      </w:r>
+    </w:p>
+    <w:p>
+      <w:r>
+        <w:t xml:space="preserve">|     10     | [6 1 1]   0.09201807921087779   </w:t>
+      </w:r>
+    </w:p>
+    <w:p>
+      <w:r>
+        <w:t xml:space="preserve">|     11     | [6 1 2]  0.0034314949457290187  </w:t>
+      </w:r>
+    </w:p>
+    <w:p>
+      <w:r>
+        <w:t xml:space="preserve">|     12     | [7 1 1]   0.09202961887163957   </w:t>
+      </w:r>
+    </w:p>
+    <w:p>
+      <w:r>
+        <w:t xml:space="preserve">|     13     | [7 1 2]   0.002955200556981629  </w:t>
+      </w:r>
+    </w:p>
+    <w:p>
+      <w:r>
+        <w:t xml:space="preserve">|     14     | [8 1 1]   0.09239051330774134   </w:t>
+      </w:r>
+    </w:p>
+    <w:p>
+      <w:r>
+        <w:t xml:space="preserve">|     15     | [8 1 2]  0.0012183207163447027  </w:t>
+      </w:r>
+    </w:p>
+    <w:p>
+      <w:r>
+        <w:t xml:space="preserve">|     16     | [1 2 1]   0.003045135807040027  </w:t>
+      </w:r>
+    </w:p>
+    <w:p>
+      <w:r>
+        <w:t xml:space="preserve">|     17     | [1 2 2]    0.0904573249067267   </w:t>
+      </w:r>
+    </w:p>
+    <w:p>
+      <w:r>
+        <w:t xml:space="preserve">|     18     | [2 2 1]  0.00010332304430697192 </w:t>
+      </w:r>
+    </w:p>
+    <w:p>
+      <w:r>
+        <w:t xml:space="preserve">|     19     | [2 2 2]  0.0020912071821705463  </w:t>
+      </w:r>
+    </w:p>
+    <w:p>
+      <w:r>
+        <w:t xml:space="preserve">|     20     | [3 2 1]  0.0010045828688661164  </w:t>
+      </w:r>
+    </w:p>
+    <w:p>
+      <w:r>
+        <w:t xml:space="preserve">|     21     | [3 2 2]   0.001887964698753226  </w:t>
+      </w:r>
+    </w:p>
+    <w:p>
+      <w:r>
+        <w:t xml:space="preserve">|     22     | [4 2 1]  0.0026305852720322816  </w:t>
+      </w:r>
+    </w:p>
+    <w:p>
+      <w:r>
+        <w:t xml:space="preserve">|     23     | [4 2 2]  0.0014440828890315341  </w:t>
+      </w:r>
+    </w:p>
+    <w:p>
+      <w:r>
+        <w:t xml:space="preserve">|     24     | [5 2 1]  2.570122194979101e-05  </w:t>
+      </w:r>
+    </w:p>
+    <w:p>
+      <w:r>
+        <w:t xml:space="preserve">|     25     | [5 2 2]  4.1723994838580215e-05 </w:t>
+      </w:r>
+    </w:p>
+    <w:p>
+      <w:r>
+        <w:t xml:space="preserve">|     26     | [6 2 1]   3.34658214665098e-05  </w:t>
+      </w:r>
+    </w:p>
+    <w:p>
+      <w:r>
+        <w:t xml:space="preserve">|     27     | [6 2 2]  0.00016972488878615698 </w:t>
+      </w:r>
+    </w:p>
+    <w:p>
+      <w:r>
+        <w:t xml:space="preserve">|     28     | [7 2 1]  0.0001734102287709947  </w:t>
+      </w:r>
+    </w:p>
+    <w:p>
+      <w:r>
+        <w:t xml:space="preserve">|     29     | [7 2 2]  5.407192052654433e-05  </w:t>
+      </w:r>
+    </w:p>
+    <w:p>
+      <w:r>
+        <w:t xml:space="preserve">|     30     | [8 2 1]   0.08850827809265685   </w:t>
+      </w:r>
+    </w:p>
+    <w:p>
+      <w:r>
+        <w:t xml:space="preserve">|     31     | [8 2 2]   0.004022396303953474  </w:t>
+      </w:r>
+    </w:p>
+    <w:p>
+      <w:r>
+        <w:t xml:space="preserve">|     32     | [1 3 1]  2.2925425207340598e-05 </w:t>
+      </w:r>
+    </w:p>
+    <w:p>
+      <w:r>
+        <w:t xml:space="preserve">|     33     | [1 3 2]   0.09029737127367615   </w:t>
+      </w:r>
+    </w:p>
+    <w:p>
+      <w:r>
+        <w:t xml:space="preserve">|     34     | [2 3 1]  5.099045742915306e-07  </w:t>
+      </w:r>
+    </w:p>
+    <w:p>
+      <w:r>
+        <w:t xml:space="preserve">|     35     | [2 3 2]   0.001799986062956309  </w:t>
+      </w:r>
+    </w:p>
+    <w:p>
+      <w:r>
+        <w:t xml:space="preserve">|     36     | [3 3 1]  0.00010007164976226995 </w:t>
+      </w:r>
+    </w:p>
+    <w:p>
+      <w:r>
+        <w:lastRenderedPageBreak/>
+        <w:t xml:space="preserve">|     37     | [3 3 2]  8.828114723932214e-05  </w:t>
+      </w:r>
+    </w:p>
+    <w:p>
+      <w:r>
+        <w:t xml:space="preserve">|     38     | [4 3 1]   6.48079832142115e-05  </w:t>
+      </w:r>
+    </w:p>
+    <w:p>
+      <w:r>
+        <w:t xml:space="preserve">|     39     | [4 3 2]  2.7227200219036834e-05 </w:t>
+      </w:r>
+    </w:p>
+    <w:p>
+      <w:r>
+        <w:t xml:space="preserve">|     40     | [5 3 1]  7.924179378909734e-06  </w:t>
+      </w:r>
+    </w:p>
+    <w:p>
+      <w:r>
+        <w:t xml:space="preserve">|     41     | [5 3 2]   0.003727382318842995  </w:t>
+      </w:r>
+    </w:p>
+    <w:p>
+      <w:r>
+        <w:t xml:space="preserve">|     42     | [6 3 1]  8.604957776682664e-05  </w:t>
+      </w:r>
+    </w:p>
+    <w:p>
+      <w:r>
+        <w:t xml:space="preserve">|     43     | [6 3 2]   0.008286630223900127  </w:t>
+      </w:r>
+    </w:p>
+    <w:p>
+      <w:r>
+        <w:t xml:space="preserve">|     44     | [7 3 1]  0.0034678066493582056  </w:t>
+      </w:r>
+    </w:p>
+    <w:p>
+      <w:r>
+        <w:t xml:space="preserve">|     45     | [7 3 2]  0.0003263904886020482  </w:t>
+      </w:r>
+    </w:p>
+    <w:p>
+      <w:r>
+        <w:t xml:space="preserve">|     46     | [8 3 1]    0.087439875951513    </w:t>
+      </w:r>
+    </w:p>
+    <w:p>
+      <w:r>
+        <w:t xml:space="preserve">|     47     | [8 3 2]   0.003686166546031429  </w:t>
+      </w:r>
+    </w:p>
+    <w:p>
+      <w:r>
+        <w:t xml:space="preserve">|     48     | [1 4 1]  8.445381256989571e-05  </w:t>
+      </w:r>
+    </w:p>
+    <w:p>
+      <w:r>
+        <w:t xml:space="preserve">|     49     | [1 4 2]   0.09456447769143465   </w:t>
+      </w:r>
+    </w:p>
+    <w:p>
+      <w:r>
+        <w:t xml:space="preserve">|     50     | [2 4 1]  9.070776671943265e-05  </w:t>
+      </w:r>
+    </w:p>
+    <w:p>
+      <w:r>
+        <w:t xml:space="preserve">|     51     | [2 4 2]  9.850486342145197e-05  </w:t>
+      </w:r>
+    </w:p>
+    <w:p>
+      <w:r>
+        <w:t xml:space="preserve">|     52     | [3 4 1]   0.006060307777975265  </w:t>
+      </w:r>
+    </w:p>
+    <w:p>
+      <w:r>
+        <w:t xml:space="preserve">|     53     | [3 4 2]  3.280005890767215e-06  </w:t>
+      </w:r>
+    </w:p>
+    <w:p>
+      <w:r>
+        <w:t xml:space="preserve">|     54     | [4 4 1]   0.00536196131613442   </w:t>
+      </w:r>
+    </w:p>
+    <w:p>
+      <w:r>
+        <w:t xml:space="preserve">|     55     | [4 4 2]  6.615231484101325e-06  </w:t>
+      </w:r>
+    </w:p>
+    <w:p>
+      <w:r>
+        <w:t xml:space="preserve">|     56     | [5 4 1]   0.006179167494790859  </w:t>
+      </w:r>
+    </w:p>
+    <w:p>
+      <w:r>
+        <w:t xml:space="preserve">|     57     | [5 4 2]    0.9245808481140427   </w:t>
+      </w:r>
+    </w:p>
+    <w:p>
+      <w:r>
+        <w:t xml:space="preserve">|     58     | [6 4 1]  0.0015501947099785633  </w:t>
+      </w:r>
+    </w:p>
+    <w:p>
+      <w:r>
+        <w:t xml:space="preserve">|     59     | [6 4 2]   0.004594718727442413  </w:t>
+      </w:r>
+    </w:p>
+    <w:p>
+      <w:r>
+        <w:t xml:space="preserve">|     60     | [7 4 1]  0.0008869792444805353  </w:t>
+      </w:r>
+    </w:p>
+    <w:p>
+      <w:r>
+        <w:t xml:space="preserve">|     61     | [7 4 2]  0.0020222056566376444  </w:t>
+      </w:r>
+    </w:p>
+    <w:p>
+      <w:r>
+        <w:t xml:space="preserve">|     62     | [8 4 1]   0.02427423226686124   </w:t>
+      </w:r>
+    </w:p>
+    <w:p>
+      <w:r>
+        <w:t xml:space="preserve">|     63     | [8 4 2]   0.07085445246074322   </w:t>
+      </w:r>
+    </w:p>
+    <w:p>
+      <w:r>
+        <w:t xml:space="preserve">|     64     | [1 5 1]  0.0027335181119137893  </w:t>
+      </w:r>
+    </w:p>
+    <w:p>
+      <w:r>
+        <w:lastRenderedPageBreak/>
+        <w:t xml:space="preserve">|     65     | [1 5 2]   0.09509855611493445   </w:t>
+      </w:r>
+    </w:p>
+    <w:p>
+      <w:r>
+        <w:t xml:space="preserve">|     66     | [2 5 1]  0.0003004129553400307  </w:t>
+      </w:r>
+    </w:p>
+    <w:p>
+      <w:r>
+        <w:t xml:space="preserve">|     67     | [2 5 2]  0.00013152445307781832 </w:t>
+      </w:r>
+    </w:p>
+    <w:p>
+      <w:r>
+        <w:t xml:space="preserve">|     68     | [3 5 1]   0.00803173010874077   </w:t>
+      </w:r>
+    </w:p>
+    <w:p>
+      <w:r>
+        <w:t xml:space="preserve">|     69     | [3 5 2]  4.935511114249082e-05  </w:t>
+      </w:r>
+    </w:p>
+    <w:p>
+      <w:r>
+        <w:t xml:space="preserve">|     70     | [4 5 1]   0.010605045906855442  </w:t>
+      </w:r>
+    </w:p>
+    <w:p>
+      <w:r>
+        <w:t xml:space="preserve">|     71     | [4 5 2]  0.0040168537057828895  </w:t>
+      </w:r>
+    </w:p>
+    <w:p>
+      <w:r>
+        <w:t xml:space="preserve">|     72     | [5 5 1]   0.003628450878483168  </w:t>
+      </w:r>
+    </w:p>
+    <w:p>
+      <w:r>
+        <w:t xml:space="preserve">|     73     | [5 5 2]   0.007705636645604455  </w:t>
+      </w:r>
+    </w:p>
+    <w:p>
+      <w:r>
+        <w:t xml:space="preserve">|     74     | [6 5 1]  0.0001253335212285656  </w:t>
+      </w:r>
+    </w:p>
+    <w:p>
+      <w:r>
+        <w:t xml:space="preserve">|     75     | [6 5 2]  6.312785409928043e-05  </w:t>
+      </w:r>
+    </w:p>
+    <w:p>
+      <w:r>
+        <w:t xml:space="preserve">|     76     | [7 5 1]  4.043217845197785e-06  </w:t>
+      </w:r>
+    </w:p>
+    <w:p>
+      <w:r>
+        <w:t xml:space="preserve">|     77     | [7 5 2]  0.0001147367537336606  </w:t>
+      </w:r>
+    </w:p>
+    <w:p>
+      <w:r>
+        <w:t xml:space="preserve">|     78     | [8 5 1]  0.0026501463201317197  </w:t>
+      </w:r>
+    </w:p>
+    <w:p>
+      <w:r>
+        <w:t xml:space="preserve">|     79     | [8 5 2]   0.09197883327450565   </w:t>
+      </w:r>
+    </w:p>
+    <w:p>
+      <w:r>
+        <w:t xml:space="preserve">|     80     | [1 6 1]   0.002640372588326564  </w:t>
+      </w:r>
+    </w:p>
+    <w:p>
+      <w:r>
+        <w:t xml:space="preserve">|     81     | [1 6 2]    0.0892325359907152   </w:t>
+      </w:r>
+    </w:p>
+    <w:p>
+      <w:r>
+        <w:t xml:space="preserve">|     82     | [2 6 1]  6.600211090805993e-05  </w:t>
+      </w:r>
+    </w:p>
+    <w:p>
+      <w:r>
+        <w:t xml:space="preserve">|     83     | [2 6 2]  0.0027209405678577576  </w:t>
+      </w:r>
+    </w:p>
+    <w:p>
+      <w:r>
+        <w:t xml:space="preserve">|     84     | [3 6 1]  5.109985173813719e-05  </w:t>
+      </w:r>
+    </w:p>
+    <w:p>
+      <w:r>
+        <w:t xml:space="preserve">|     85     | [3 6 2]  0.00034643795546080157 </w:t>
+      </w:r>
+    </w:p>
+    <w:p>
+      <w:r>
+        <w:t xml:space="preserve">|     86     | [4 6 1]  0.00015175772028828258 </w:t>
+      </w:r>
+    </w:p>
+    <w:p>
+      <w:r>
+        <w:t xml:space="preserve">|     87     | [4 6 2]  0.0035835487779337294  </w:t>
+      </w:r>
+    </w:p>
+    <w:p>
+      <w:r>
+        <w:t xml:space="preserve">|     88     | [5 6 1]  4.269697990486099e-05  </w:t>
+      </w:r>
+    </w:p>
+    <w:p>
+      <w:r>
+        <w:t xml:space="preserve">|     89     | [5 6 2]  0.0001458524515053506  </w:t>
+      </w:r>
+    </w:p>
+    <w:p>
+      <w:r>
+        <w:t xml:space="preserve">|     90     | [6 6 1]  3.8871927200543165e-06 </w:t>
+      </w:r>
+    </w:p>
+    <w:p>
+      <w:r>
+        <w:t xml:space="preserve">|     91     | [6 6 2]  6.072279083077232e-07  </w:t>
+      </w:r>
+    </w:p>
+    <w:p>
+      <w:r>
+        <w:t xml:space="preserve">|     92     | [7 6 1]  0.00010196048101673468 </w:t>
+      </w:r>
+    </w:p>
+    <w:p>
+      <w:r>
+        <w:lastRenderedPageBreak/>
+        <w:t xml:space="preserve">|     93     | [7 6 2]   9.4971550150546e-05   </w:t>
+      </w:r>
+    </w:p>
+    <w:p>
+      <w:r>
+        <w:t xml:space="preserve">|     94     | [8 6 1]  7.394796713242112e-05  </w:t>
+      </w:r>
+    </w:p>
+    <w:p>
+      <w:r>
+        <w:t xml:space="preserve">|     95     | [8 6 2]   0.09193725679651128   </w:t>
+      </w:r>
+    </w:p>
+    <w:p>
+      <w:r>
+        <w:t xml:space="preserve">|     96     | [1 7 1]  0.0006117118417023899  </w:t>
+      </w:r>
+    </w:p>
+    <w:p>
+      <w:r>
+        <w:t xml:space="preserve">|     97     | [1 7 2]   0.08850827809265423   </w:t>
+      </w:r>
+    </w:p>
+    <w:p>
+      <w:r>
+        <w:t xml:space="preserve">|     98     | [2 7 1]  1.4157228413396655e-05 </w:t>
+      </w:r>
+    </w:p>
+    <w:p>
+      <w:r>
+        <w:t xml:space="preserve">|     99     | [2 7 2]  0.0035840946910219284  </w:t>
+      </w:r>
+    </w:p>
+    <w:p>
+      <w:r>
+        <w:t xml:space="preserve">|     100    | [3 7 1]  3.155657238138246e-05  </w:t>
+      </w:r>
+    </w:p>
+    <w:p>
+      <w:r>
+        <w:t xml:space="preserve">|     101    | [3 7 2]  0.00021342442600092088 </w:t>
+      </w:r>
+    </w:p>
+    <w:p>
+      <w:r>
+        <w:t xml:space="preserve">|     102    | [4 7 1]  2.310436721139858e-05  </w:t>
+      </w:r>
+    </w:p>
+    <w:p>
+      <w:r>
+        <w:t xml:space="preserve">|     103    | [4 7 2]  4.4320849576975755e-05 </w:t>
+      </w:r>
+    </w:p>
+    <w:p>
+      <w:r>
+        <w:t xml:space="preserve">|     104    | [5 7 1]   0.00271209337956437   </w:t>
+      </w:r>
+    </w:p>
+    <w:p>
+      <w:r>
+        <w:t xml:space="preserve">|     105    | [5 7 2]  1.5734612384484816e-06 </w:t>
+      </w:r>
+    </w:p>
+    <w:p>
+      <w:r>
+        <w:t xml:space="preserve">|     106    | [6 7 1]   0.002285019873591741  </w:t>
+      </w:r>
+    </w:p>
+    <w:p>
+      <w:r>
+        <w:t xml:space="preserve">|     107    | [6 7 2]  8.512143175081968e-05  </w:t>
+      </w:r>
+    </w:p>
+    <w:p>
+      <w:r>
+        <w:t xml:space="preserve">|     108    | [7 7 1]   0.002503874845156266  </w:t>
+      </w:r>
+    </w:p>
+    <w:p>
+      <w:r>
+        <w:t xml:space="preserve">|     109    | [7 7 2]  0.0017266049881500824  </w:t>
+      </w:r>
+    </w:p>
+    <w:p>
+      <w:r>
+        <w:t xml:space="preserve">|     110    | [8 7 1]  8.135957589266121e-05  </w:t>
+      </w:r>
+    </w:p>
+    <w:p>
+      <w:r>
+        <w:t xml:space="preserve">|     111    | [8 7 2]   0.09326855911358391   </w:t>
+      </w:r>
+    </w:p>
+    <w:p>
+      <w:r>
+        <w:t xml:space="preserve">|     112    | [1 8 1]   0.09307312905978377   </w:t>
+      </w:r>
+    </w:p>
+    <w:p>
+      <w:r>
+        <w:t xml:space="preserve">|     113    | [1 8 2]   0.09239051330773826   </w:t>
+      </w:r>
+    </w:p>
+    <w:p>
+      <w:r>
+        <w:t xml:space="preserve">|     114    | [2 8 1]   0.09493389732648086   </w:t>
+      </w:r>
+    </w:p>
+    <w:p>
+      <w:r>
+        <w:t xml:space="preserve">|     115    | [2 8 2]  0.00018868327090788422 </w:t>
+      </w:r>
+    </w:p>
+    <w:p>
+      <w:r>
+        <w:t xml:space="preserve">|     116    | [3 8 1]   0.09541789854318633   </w:t>
+      </w:r>
+    </w:p>
+    <w:p>
+      <w:r>
+        <w:t xml:space="preserve">|     117    | [3 8 2]  3.167561341783647e-05  </w:t>
+      </w:r>
+    </w:p>
+    <w:p>
+      <w:r>
+        <w:t xml:space="preserve">|     118    | [4 8 1]   0.08941492693475149   </w:t>
+      </w:r>
+    </w:p>
+    <w:p>
+      <w:r>
+        <w:t xml:space="preserve">|     119    | [4 8 2]   0.002729924796065771  </w:t>
+      </w:r>
+    </w:p>
+    <w:p>
+      <w:r>
+        <w:t xml:space="preserve">|     120    | [5 8 1]   0.08971217771475525   </w:t>
+      </w:r>
+    </w:p>
+    <w:p>
+      <w:r>
+        <w:lastRenderedPageBreak/>
+        <w:t xml:space="preserve">|     121    | [5 8 2]  0.0016357678751079538  </w:t>
+      </w:r>
+    </w:p>
+    <w:p>
+      <w:r>
+        <w:t xml:space="preserve">|     122    | [6 8 1]   0.08999647924914889   </w:t>
+      </w:r>
+    </w:p>
+    <w:p>
+      <w:r>
+        <w:t xml:space="preserve">|     123    | [6 8 2]  0.0027474778643904823  </w:t>
+      </w:r>
+    </w:p>
+    <w:p>
+      <w:r>
+        <w:t xml:space="preserve">|     124    | [7 8 1]   0.09885963786478025   </w:t>
+      </w:r>
+    </w:p>
+    <w:p>
+      <w:r>
+        <w:t xml:space="preserve">|     125    | [7 8 2]  0.0014779198353957433  </w:t>
+      </w:r>
+    </w:p>
+    <w:p>
+      <w:r>
+        <w:t xml:space="preserve">|     126    | [8 8 1]    0.1258546386146429   </w:t>
+      </w:r>
+    </w:p>
+    <w:p>
+      <w:r>
+        <w:t xml:space="preserve">|     127    | [8 8 2]   0.09230077251248617   </w:t>
+      </w:r>
+    </w:p>
+    <w:p>
+      <w:r>
+        <w:t>[-3.14109911 -2.9489505   2.9489505   3.14109911]-------</w:t>
+      </w:r>
+    </w:p>
+    <w:p>
+      <w:r>
+        <w:t>4</w:t>
+      </w:r>
+    </w:p>
+    <w:p>
+      <w:r>
+        <w:t xml:space="preserve">       Epsilon        |          Rho           </w:t>
+      </w:r>
+    </w:p>
+    <w:p>
+      <w:r>
+        <w:t>--------------------------------------------------------</w:t>
+      </w:r>
+    </w:p>
+    <w:p>
+      <w:r>
+        <w:t xml:space="preserve"> -3.1410991053588724  |   0.4622904073252617   </w:t>
+      </w:r>
+    </w:p>
+    <w:p>
+      <w:r>
+        <w:t xml:space="preserve"> -2.9489505007883676  | 1.673184564339033e-08  </w:t>
+      </w:r>
+    </w:p>
+    <w:p>
+      <w:r>
+        <w:t xml:space="preserve">  -2.755988561756343  | 1.800896306826167e-06  </w:t>
+      </w:r>
+    </w:p>
+    <w:p>
+      <w:r>
+        <w:t xml:space="preserve"> -2.5627390199526006  | 5.3482605906672484e-08 </w:t>
+      </w:r>
+    </w:p>
+    <w:p>
+      <w:r>
+        <w:t xml:space="preserve">  -2.369950067198861  | 2.3023675637537144e-06 </w:t>
+      </w:r>
+    </w:p>
+    <w:p>
+      <w:r>
+        <w:t xml:space="preserve">  -2.179898229437352  | 6.640464401303638e-07  </w:t>
+      </w:r>
+    </w:p>
+    <w:p>
+      <w:r>
+        <w:t xml:space="preserve"> -2.0001055326039743  | 5.774516793741742e-05  </w:t>
+      </w:r>
+    </w:p>
+    <w:p>
+      <w:r>
+        <w:t xml:space="preserve"> -1.8896930990932137  | 0.00024154957673792204 </w:t>
+      </w:r>
+    </w:p>
+    <w:p>
+      <w:r>
+        <w:t xml:space="preserve"> -1.8817518777301847  | 0.0010435044598529667  </w:t>
+      </w:r>
+    </w:p>
+    <w:p>
+      <w:r>
+        <w:t xml:space="preserve"> -1.8714444437429931  |  0.000662803075304861  </w:t>
+      </w:r>
+    </w:p>
+    <w:p>
+      <w:r>
+        <w:t xml:space="preserve"> -1.8582888001218343  | 0.0037610191324271795  </w:t>
+      </w:r>
+    </w:p>
+    <w:p>
+      <w:r>
+        <w:t xml:space="preserve"> -1.8321346663486413  |  5.0567102284001e-05   </w:t>
+      </w:r>
+    </w:p>
+    <w:p>
+      <w:r>
+        <w:t xml:space="preserve">  -1.803248399352072  | 0.0009676713643524008  </w:t>
+      </w:r>
+    </w:p>
+    <w:p>
+      <w:r>
+        <w:t xml:space="preserve"> -1.7960079596727418  | 0.00024289395622285865 </w:t>
+      </w:r>
+    </w:p>
+    <w:p>
+      <w:r>
+        <w:t xml:space="preserve">  -1.778287109021078  | 0.00034183196997488217 </w:t>
+      </w:r>
+    </w:p>
+    <w:p>
+      <w:r>
+        <w:t xml:space="preserve">  -1.771609783846213  | 5.132824557664454e-05  </w:t>
+      </w:r>
+    </w:p>
+    <w:p>
+      <w:r>
+        <w:t xml:space="preserve"> -1.7544169466707284  | 0.0009971679185181513  </w:t>
+      </w:r>
+    </w:p>
+    <w:p>
+      <w:r>
+        <w:lastRenderedPageBreak/>
+        <w:t xml:space="preserve"> -1.7508403815144098  |  0.000615731554501364  </w:t>
+      </w:r>
+    </w:p>
+    <w:p>
+      <w:r>
+        <w:t xml:space="preserve"> -1.7364521082810536  |  0.000862517219383838  </w:t>
+      </w:r>
+    </w:p>
+    <w:p>
+      <w:r>
+        <w:t xml:space="preserve"> -1.7335293805881637  | 0.00024154379827532658 </w:t>
+      </w:r>
+    </w:p>
+    <w:p>
+      <w:r>
+        <w:t xml:space="preserve"> -1.7191738484399925  | 0.00046796437895360577 </w:t>
+      </w:r>
+    </w:p>
+    <w:p>
+      <w:r>
+        <w:t xml:space="preserve"> -1.7168117453712743  | 0.0009172826423801715  </w:t>
+      </w:r>
+    </w:p>
+    <w:p>
+      <w:r>
+        <w:t xml:space="preserve">  -1.705162025788391  | 3.572721235574413e-05  </w:t>
+      </w:r>
+    </w:p>
+    <w:p>
+      <w:r>
+        <w:t xml:space="preserve"> -1.6756437058545854  | 0.0011841735552245375  </w:t>
+      </w:r>
+    </w:p>
+    <w:p>
+      <w:r>
+        <w:t xml:space="preserve"> -1.6643218091240004  | 0.0010049785240502226  </w:t>
+      </w:r>
+    </w:p>
+    <w:p>
+      <w:r>
+        <w:t xml:space="preserve"> -1.6579292259450307  | 0.00011961297486544928 </w:t>
+      </w:r>
+    </w:p>
+    <w:p>
+      <w:r>
+        <w:t xml:space="preserve"> -1.6385451587524027  | 0.0013510114151512119  </w:t>
+      </w:r>
+    </w:p>
+    <w:p>
+      <w:r>
+        <w:t xml:space="preserve"> -1.6318993111882512  | 0.00036041476608498113 </w:t>
+      </w:r>
+    </w:p>
+    <w:p>
+      <w:r>
+        <w:t xml:space="preserve">  -1.627612174172681  | 0.0035599213509143806  </w:t>
+      </w:r>
+    </w:p>
+    <w:p>
+      <w:r>
+        <w:t xml:space="preserve">  -1.616360591177666  | 0.0001849395157065636  </w:t>
+      </w:r>
+    </w:p>
+    <w:p>
+      <w:r>
+        <w:t xml:space="preserve"> -1.5950582290562874  | 0.0006397180509456504  </w:t>
+      </w:r>
+    </w:p>
+    <w:p>
+      <w:r>
+        <w:t xml:space="preserve">  -1.589265577016542  | 0.00011698041865912039 </w:t>
+      </w:r>
+    </w:p>
+    <w:p>
+      <w:r>
+        <w:t xml:space="preserve">  -1.573270730672568  | 0.00013750502624820912 </w:t>
+      </w:r>
+    </w:p>
+    <w:p>
+      <w:r>
+        <w:t xml:space="preserve">  -1.568532824772651  | 0.0012990560433678282  </w:t>
+      </w:r>
+    </w:p>
+    <w:p>
+      <w:r>
+        <w:t xml:space="preserve"> -1.5414312607919556  | 3.491399296859205e-05  </w:t>
+      </w:r>
+    </w:p>
+    <w:p>
+      <w:r>
+        <w:t xml:space="preserve">  -1.537715685911059  |  0.000161021009694269  </w:t>
+      </w:r>
+    </w:p>
+    <w:p>
+      <w:r>
+        <w:t xml:space="preserve"> -1.5264349033335922  | 8.628995014994687e-05  </w:t>
+      </w:r>
+    </w:p>
+    <w:p>
+      <w:r>
+        <w:t xml:space="preserve"> -1.5248870266883912  |  5.02458061102011e-05  </w:t>
+      </w:r>
+    </w:p>
+    <w:p>
+      <w:r>
+        <w:t xml:space="preserve"> -1.5164642785716302  | 0.0005913022517120993  </w:t>
+      </w:r>
+    </w:p>
+    <w:p>
+      <w:r>
+        <w:t xml:space="preserve">  -1.509985095950637  | 2.6504072508817644e-05 </w:t>
+      </w:r>
+    </w:p>
+    <w:p>
+      <w:r>
+        <w:t xml:space="preserve"> -1.5018114678717414  | 0.00025233712472045715 </w:t>
+      </w:r>
+    </w:p>
+    <w:p>
+      <w:r>
+        <w:t xml:space="preserve"> -1.4873050785404431  | 2.3502832203219256e-05 </w:t>
+      </w:r>
+    </w:p>
+    <w:p>
+      <w:r>
+        <w:t xml:space="preserve">  -1.469370729282664  | 0.0005231524880776334  </w:t>
+      </w:r>
+    </w:p>
+    <w:p>
+      <w:r>
+        <w:t xml:space="preserve"> -1.4527420912162927  | 0.00028020876064885624 </w:t>
+      </w:r>
+    </w:p>
+    <w:p>
+      <w:r>
+        <w:t xml:space="preserve">  -1.429590783450073  | 0.0012670566594275437  </w:t>
+      </w:r>
+    </w:p>
+    <w:p>
+      <w:r>
+        <w:lastRenderedPageBreak/>
+        <w:t xml:space="preserve"> -1.4109430849445512  | 0.0001232113161807245  </w:t>
+      </w:r>
+    </w:p>
+    <w:p>
+      <w:r>
+        <w:t xml:space="preserve">  -1.394090736428889  | 0.0009555189298838855  </w:t>
+      </w:r>
+    </w:p>
+    <w:p>
+      <w:r>
+        <w:t xml:space="preserve"> -1.3728989877782163  | 0.0007945003159501194  </w:t>
+      </w:r>
+    </w:p>
+    <w:p>
+      <w:r>
+        <w:t xml:space="preserve"> -1.3446420179783534  | 0.0031769090915588394  </w:t>
+      </w:r>
+    </w:p>
+    <w:p>
+      <w:r>
+        <w:t xml:space="preserve"> -1.3312821632298877  | 1.9613391021239446e-05 </w:t>
+      </w:r>
+    </w:p>
+    <w:p>
+      <w:r>
+        <w:t xml:space="preserve"> -1.3270984459970292  |  8.20557418063644e-05  </w:t>
+      </w:r>
+    </w:p>
+    <w:p>
+      <w:r>
+        <w:t xml:space="preserve">  -1.299305453078781  | 0.00020903356358594627 </w:t>
+      </w:r>
+    </w:p>
+    <w:p>
+      <w:r>
+        <w:t xml:space="preserve"> -1.2954723742882885  | 0.0028028824417352244  </w:t>
+      </w:r>
+    </w:p>
+    <w:p>
+      <w:r>
+        <w:t xml:space="preserve"> -1.2844054839512016  | 0.0007804157685269683  </w:t>
+      </w:r>
+    </w:p>
+    <w:p>
+      <w:r>
+        <w:t xml:space="preserve">  -1.275636376869013  | 4.2325195790839174e-05 </w:t>
+      </w:r>
+    </w:p>
+    <w:p>
+      <w:r>
+        <w:t xml:space="preserve"> -1.2567146834184404  | 0.00019769907103264932 </w:t>
+      </w:r>
+    </w:p>
+    <w:p>
+      <w:r>
+        <w:t xml:space="preserve"> -1.2404278230666985  | 2.719737041501143e-05  </w:t>
+      </w:r>
+    </w:p>
+    <w:p>
+      <w:r>
+        <w:t xml:space="preserve"> -1.2394516286419666  | 0.0036793343577493885  </w:t>
+      </w:r>
+    </w:p>
+    <w:p>
+      <w:r>
+        <w:t xml:space="preserve"> -1.0818522878211947  | 3.014329566433307e-07  </w:t>
+      </w:r>
+    </w:p>
+    <w:p>
+      <w:r>
+        <w:t xml:space="preserve"> -0.8941580297730715  | 7.752289764606677e-09  </w:t>
+      </w:r>
+    </w:p>
+    <w:p>
+      <w:r>
+        <w:t xml:space="preserve"> -0.6989577777698368  | 4.440063293484597e-08  </w:t>
+      </w:r>
+    </w:p>
+    <w:p>
+      <w:r>
+        <w:t xml:space="preserve"> -0.5006337365775861  | 4.263718597842905e-09  </w:t>
+      </w:r>
+    </w:p>
+    <w:p>
+      <w:r>
+        <w:t xml:space="preserve"> -0.3008271428910872  | 4.303859172047171e-09  </w:t>
+      </w:r>
+    </w:p>
+    <w:p>
+      <w:r>
+        <w:t xml:space="preserve"> -0.10034121244882811 | 1.0765726279121534e-09 </w:t>
+      </w:r>
+    </w:p>
+    <w:p>
+      <w:r>
+        <w:t xml:space="preserve"> 0.10034121244882767  | 1.0765726279163844e-09 </w:t>
+      </w:r>
+    </w:p>
+    <w:p>
+      <w:r>
+        <w:t xml:space="preserve"> 0.30082714289108575  |  4.30385917207688e-09  </w:t>
+      </w:r>
+    </w:p>
+    <w:p>
+      <w:r>
+        <w:t xml:space="preserve">  0.5006337365775853  | 4.263718597926406e-09  </w:t>
+      </w:r>
+    </w:p>
+    <w:p>
+      <w:r>
+        <w:t xml:space="preserve">  0.6989577777698364  |  4.44006329351046e-08  </w:t>
+      </w:r>
+    </w:p>
+    <w:p>
+      <w:r>
+        <w:t xml:space="preserve">  0.8941580297730727  | 7.752289764599016e-09  </w:t>
+      </w:r>
+    </w:p>
+    <w:p>
+      <w:r>
+        <w:t xml:space="preserve">  1.0818522878211954  | 3.014329566432749e-07  </w:t>
+      </w:r>
+    </w:p>
+    <w:p>
+      <w:r>
+        <w:t xml:space="preserve">  1.2394516286419668  | 0.0036793343577492016  </w:t>
+      </w:r>
+    </w:p>
+    <w:p>
+      <w:r>
+        <w:t xml:space="preserve">  1.2404278230667005  | 2.719737041500912e-05  </w:t>
+      </w:r>
+    </w:p>
+    <w:p>
+      <w:r>
+        <w:t xml:space="preserve">  1.2567146834184406  | 0.00019769907103279487 </w:t>
+      </w:r>
+    </w:p>
+    <w:p>
+      <w:r>
+        <w:lastRenderedPageBreak/>
+        <w:t xml:space="preserve">  1.2756363768690129  | 4.232519579085231e-05  </w:t>
+      </w:r>
+    </w:p>
+    <w:p>
+      <w:r>
+        <w:t xml:space="preserve">  1.2844054839512007  | 0.0007804157685269721  </w:t>
+      </w:r>
+    </w:p>
+    <w:p>
+      <w:r>
+        <w:t xml:space="preserve">  1.2954723742882892  | 0.0028028824417362353  </w:t>
+      </w:r>
+    </w:p>
+    <w:p>
+      <w:r>
+        <w:t xml:space="preserve">  1.2993054530787798  | 0.00020903356358677508 </w:t>
+      </w:r>
+    </w:p>
+    <w:p>
+      <w:r>
+        <w:t xml:space="preserve">  1.3270984459970294  | 8.205574180634079e-05  </w:t>
+      </w:r>
+    </w:p>
+    <w:p>
+      <w:r>
+        <w:t xml:space="preserve">  1.3312821632298886  | 1.9613391021241397e-05 </w:t>
+      </w:r>
+    </w:p>
+    <w:p>
+      <w:r>
+        <w:t xml:space="preserve">  1.3446420179783536  | 0.0031769090915588277  </w:t>
+      </w:r>
+    </w:p>
+    <w:p>
+      <w:r>
+        <w:t xml:space="preserve">  1.3728989877782172  | 0.0007945003159501578  </w:t>
+      </w:r>
+    </w:p>
+    <w:p>
+      <w:r>
+        <w:t xml:space="preserve">  1.3940907364288893  | 0.0009555189298839802  </w:t>
+      </w:r>
+    </w:p>
+    <w:p>
+      <w:r>
+        <w:t xml:space="preserve">  1.4109430849445506  | 0.00012321131618080425 </w:t>
+      </w:r>
+    </w:p>
+    <w:p>
+      <w:r>
+        <w:t xml:space="preserve">  1.4295907834500727  | 0.0012670566594274795  </w:t>
+      </w:r>
+    </w:p>
+    <w:p>
+      <w:r>
+        <w:t xml:space="preserve">  1.4527420912162916  | 0.00028020876064883043 </w:t>
+      </w:r>
+    </w:p>
+    <w:p>
+      <w:r>
+        <w:t xml:space="preserve">  1.4693707292826643  | 0.0005231524880776802  </w:t>
+      </w:r>
+    </w:p>
+    <w:p>
+      <w:r>
+        <w:t xml:space="preserve">  1.4873050785404442  | 2.3502832203203067e-05 </w:t>
+      </w:r>
+    </w:p>
+    <w:p>
+      <w:r>
+        <w:t xml:space="preserve">  1.5018114678717418  | 0.00025233712472046935 </w:t>
+      </w:r>
+    </w:p>
+    <w:p>
+      <w:r>
+        <w:t xml:space="preserve">  1.5099850959506373  | 2.650407250885337e-05  </w:t>
+      </w:r>
+    </w:p>
+    <w:p>
+      <w:r>
+        <w:t xml:space="preserve">  1.5164642785716298  | 0.0005913022517121796  </w:t>
+      </w:r>
+    </w:p>
+    <w:p>
+      <w:r>
+        <w:t xml:space="preserve">  1.5248870266883912  | 5.024580611019028e-05  </w:t>
+      </w:r>
+    </w:p>
+    <w:p>
+      <w:r>
+        <w:t xml:space="preserve">  1.5264349033335929  | 8.628995014997136e-05  </w:t>
+      </w:r>
+    </w:p>
+    <w:p>
+      <w:r>
+        <w:t xml:space="preserve">  1.537715685911059   | 0.00016102100969416416 </w:t>
+      </w:r>
+    </w:p>
+    <w:p>
+      <w:r>
+        <w:t xml:space="preserve">  1.5414312607919547  |  3.49139929685955e-05  </w:t>
+      </w:r>
+    </w:p>
+    <w:p>
+      <w:r>
+        <w:t xml:space="preserve">   1.56853282477265   | 0.0012990560433677337  </w:t>
+      </w:r>
+    </w:p>
+    <w:p>
+      <w:r>
+        <w:t xml:space="preserve">  1.5732707306725677  | 0.00013750502624820237 </w:t>
+      </w:r>
+    </w:p>
+    <w:p>
+      <w:r>
+        <w:t xml:space="preserve">  1.589265577016543   | 0.00011698041865911895 </w:t>
+      </w:r>
+    </w:p>
+    <w:p>
+      <w:r>
+        <w:t xml:space="preserve">  1.5950582290562882  | 0.0006397180509455974  </w:t>
+      </w:r>
+    </w:p>
+    <w:p>
+      <w:r>
+        <w:t xml:space="preserve">  1.616360591177666   | 0.0001849395157065375  </w:t>
+      </w:r>
+    </w:p>
+    <w:p>
+      <w:r>
+        <w:t xml:space="preserve">  1.6276121741726801  |  0.003559921350914384  </w:t>
+      </w:r>
+    </w:p>
+    <w:p>
+      <w:r>
+        <w:t xml:space="preserve">  1.6318993111882505  | 0.0003604147660848008  </w:t>
+      </w:r>
+    </w:p>
+    <w:p>
+      <w:r>
+        <w:lastRenderedPageBreak/>
+        <w:t xml:space="preserve">  1.638545158752403   | 0.0013510114151513593  </w:t>
+      </w:r>
+    </w:p>
+    <w:p>
+      <w:r>
+        <w:t xml:space="preserve">  1.6579292259450318  | 0.00011961297486545273 </w:t>
+      </w:r>
+    </w:p>
+    <w:p>
+      <w:r>
+        <w:t xml:space="preserve">  1.6643218091240013  | 0.0010049785240499823  </w:t>
+      </w:r>
+    </w:p>
+    <w:p>
+      <w:r>
+        <w:t xml:space="preserve">  1.6756437058545859  | 0.0011841735552244163  </w:t>
+      </w:r>
+    </w:p>
+    <w:p>
+      <w:r>
+        <w:t xml:space="preserve">  1.7051620257883917  | 3.5727212355771854e-05 </w:t>
+      </w:r>
+    </w:p>
+    <w:p>
+      <w:r>
+        <w:t xml:space="preserve">  1.7168117453712752  | 0.0009172826423803308  </w:t>
+      </w:r>
+    </w:p>
+    <w:p>
+      <w:r>
+        <w:t xml:space="preserve">  1.7191738484399923  | 0.0004679643789537496  </w:t>
+      </w:r>
+    </w:p>
+    <w:p>
+      <w:r>
+        <w:t xml:space="preserve">  1.7335293805881644  | 0.00024154379827530156 </w:t>
+      </w:r>
+    </w:p>
+    <w:p>
+      <w:r>
+        <w:t xml:space="preserve">  1.736452108281053   | 0.0008625172193840371  </w:t>
+      </w:r>
+    </w:p>
+    <w:p>
+      <w:r>
+        <w:t xml:space="preserve">  1.7508403815144091  | 0.0006157315545016337  </w:t>
+      </w:r>
+    </w:p>
+    <w:p>
+      <w:r>
+        <w:t xml:space="preserve">  1.7544169466707298  | 0.0009971679185182402  </w:t>
+      </w:r>
+    </w:p>
+    <w:p>
+      <w:r>
+        <w:t xml:space="preserve">  1.7716097838462133  | 5.132824557662934e-05  </w:t>
+      </w:r>
+    </w:p>
+    <w:p>
+      <w:r>
+        <w:t xml:space="preserve">  1.7782871090210786  | 0.00034183196997490743 </w:t>
+      </w:r>
+    </w:p>
+    <w:p>
+      <w:r>
+        <w:t xml:space="preserve">  1.796007959672741   | 0.00024289395622301632 </w:t>
+      </w:r>
+    </w:p>
+    <w:p>
+      <w:r>
+        <w:t xml:space="preserve">  1.8032483993520723  | 0.0009676713643524497  </w:t>
+      </w:r>
+    </w:p>
+    <w:p>
+      <w:r>
+        <w:t xml:space="preserve">  1.8321346663486404  | 5.056710228396282e-05  </w:t>
+      </w:r>
+    </w:p>
+    <w:p>
+      <w:r>
+        <w:t xml:space="preserve">  1.8582888001218332  | 0.0037610191324269197  </w:t>
+      </w:r>
+    </w:p>
+    <w:p>
+      <w:r>
+        <w:t xml:space="preserve">  1.8714444437429938  | 0.0006628030753046846  </w:t>
+      </w:r>
+    </w:p>
+    <w:p>
+      <w:r>
+        <w:t xml:space="preserve">  1.8817518777301847  |  0.001043504459853236  </w:t>
+      </w:r>
+    </w:p>
+    <w:p>
+      <w:r>
+        <w:t xml:space="preserve">  1.889693099093215   | 0.00024154957673795148 </w:t>
+      </w:r>
+    </w:p>
+    <w:p>
+      <w:r>
+        <w:t xml:space="preserve">  2.0001055326039725  | 5.7745167937422286e-05 </w:t>
+      </w:r>
+    </w:p>
+    <w:p>
+      <w:r>
+        <w:t xml:space="preserve">  2.1798982294373515  |  6.64046440129613e-07  </w:t>
+      </w:r>
+    </w:p>
+    <w:p>
+      <w:r>
+        <w:t xml:space="preserve">  2.369950067198863   | 2.3023675637529754e-06 </w:t>
+      </w:r>
+    </w:p>
+    <w:p>
+      <w:r>
+        <w:t xml:space="preserve">  2.562739019952599   | 5.348260590641667e-08  </w:t>
+      </w:r>
+    </w:p>
+    <w:p>
+      <w:r>
+        <w:t xml:space="preserve">  2.7559885617563413  | 1.8008963068227042e-06 </w:t>
+      </w:r>
+    </w:p>
+    <w:p>
+      <w:r>
+        <w:t xml:space="preserve">  2.9489505007883685  | 1.673184564320224e-08  </w:t>
+      </w:r>
+    </w:p>
+    <w:p>
+      <w:r>
+        <w:t xml:space="preserve">   3.14109910535887   |   0.4622904073250898   </w:t>
+      </w:r>
+      <w:r>
+        <w:rPr>
+          <w:rFonts w:hint="eastAsia"/>
+        </w:rPr>
+        <w:t xml:space="preserve"> -- why not 1, but half?</w:t>
       </w:r>
     </w:p>
     <w:p/>
     <w:p>
       <w:r>
-        <w:t>runcell(63, 'D:/OneDrive - Imperial College London/Desktop/master project/if I am lucky/Next-step work/HOG_SPEED_cleanup_copy_vor_correction/HOG_vorcore_real_tidy_up_no_vor.py')</w:t>
-      </w:r>
-    </w:p>
-    <w:p>
-      <w:r>
-        <w:t>| \_</w:t>
-      </w:r>
-    </w:p>
-    <w:p>
-      <w:r>
-        <w:t>| For offset = 0.01:</w:t>
-      </w:r>
-    </w:p>
-    <w:p>
-      <w:r>
-        <w:t xml:space="preserve">|  Rho table |  Sites          Rho sum         </w:t>
-      </w:r>
-    </w:p>
-    <w:p>
-      <w:r>
-        <w:t>| ------------------------------------------------------</w:t>
-      </w:r>
-    </w:p>
-    <w:p>
-      <w:r>
-        <w:t xml:space="preserve">|      0     | [1 1 1]   0.02168354401091861   </w:t>
-      </w:r>
-    </w:p>
-    <w:p>
-      <w:r>
+        <w:rPr>
+          <w:noProof/>
+        </w:rPr>
         <w:lastRenderedPageBreak/>
-        <w:t xml:space="preserve">|      1     | [1 1 2]   0.12585463861464385   </w:t>
-      </w:r>
-    </w:p>
-    <w:p>
-      <w:r>
-        <w:t xml:space="preserve">|      2     | [2 1 1]   0.024930894540970472  </w:t>
-      </w:r>
-    </w:p>
-    <w:p>
-      <w:r>
-        <w:t xml:space="preserve">|      3     | [2 1 2]   0.07910090103551375   </w:t>
-      </w:r>
-    </w:p>
-    <w:p>
-      <w:r>
-        <w:t xml:space="preserve">|      4     | [3 1 1]   0.052745046981654164  </w:t>
-      </w:r>
-    </w:p>
-    <w:p>
-      <w:r>
-        <w:t xml:space="preserve">|      5     | [3 1 2]   0.06695617220656153   </w:t>
-      </w:r>
-    </w:p>
-    <w:p>
-      <w:r>
-        <w:t xml:space="preserve">|      6     | [4 1 1]   0.09127675400621518   </w:t>
-      </w:r>
-    </w:p>
-    <w:p>
-      <w:r>
-        <w:t xml:space="preserve">|      7     | [4 1 2]   0.04003692013423522   </w:t>
-      </w:r>
-    </w:p>
-    <w:p>
-      <w:r>
-        <w:t xml:space="preserve">|      8     | [5 1 1]   0.09210675582827417   </w:t>
-      </w:r>
-    </w:p>
-    <w:p>
-      <w:r>
-        <w:t xml:space="preserve">|      9     | [5 1 2]  3.8095902544840385e-05 </w:t>
-      </w:r>
-    </w:p>
-    <w:p>
-      <w:r>
-        <w:t xml:space="preserve">|     10     | [6 1 1]   0.09201807921087779   </w:t>
-      </w:r>
-    </w:p>
-    <w:p>
-      <w:r>
-        <w:t xml:space="preserve">|     11     | [6 1 2]  0.0034314949457290187  </w:t>
-      </w:r>
-    </w:p>
-    <w:p>
-      <w:r>
-        <w:t xml:space="preserve">|     12     | [7 1 1]   0.09202961887163957   </w:t>
-      </w:r>
-    </w:p>
-    <w:p>
-      <w:r>
-        <w:t xml:space="preserve">|     13     | [7 1 2]   0.002955200556981629  </w:t>
-      </w:r>
-    </w:p>
-    <w:p>
-      <w:r>
-        <w:t xml:space="preserve">|     14     | [8 1 1]   0.09239051330774134   </w:t>
-      </w:r>
-    </w:p>
-    <w:p>
-      <w:r>
-        <w:t xml:space="preserve">|     15     | [8 1 2]  0.0012183207163447027  </w:t>
-      </w:r>
-    </w:p>
-    <w:p>
-      <w:r>
-        <w:t xml:space="preserve">|     16     | [1 2 1]   0.003045135807040027  </w:t>
-      </w:r>
-    </w:p>
-    <w:p>
-      <w:r>
-        <w:t xml:space="preserve">|     17     | [1 2 2]    0.0904573249067267   </w:t>
-      </w:r>
-    </w:p>
-    <w:p>
-      <w:r>
-        <w:t xml:space="preserve">|     18     | [2 2 1]  0.00010332304430697192 </w:t>
-      </w:r>
-    </w:p>
-    <w:p>
-      <w:r>
-        <w:t xml:space="preserve">|     19     | [2 2 2]  0.0020912071821705463  </w:t>
-      </w:r>
-    </w:p>
-    <w:p>
-      <w:r>
-        <w:t xml:space="preserve">|     20     | [3 2 1]  0.0010045828688661164  </w:t>
-      </w:r>
-    </w:p>
-    <w:p>
-      <w:r>
-        <w:t xml:space="preserve">|     21     | [3 2 2]   0.001887964698753226  </w:t>
-      </w:r>
-    </w:p>
-    <w:p>
-      <w:r>
-        <w:t xml:space="preserve">|     22     | [4 2 1]  0.0026305852720322816  </w:t>
-      </w:r>
-    </w:p>
-    <w:p>
-      <w:r>
-        <w:t xml:space="preserve">|     23     | [4 2 2]  0.0014440828890315341  </w:t>
-      </w:r>
-    </w:p>
-    <w:p>
-      <w:r>
-        <w:t xml:space="preserve">|     24     | [5 2 1]  2.570122194979101e-05  </w:t>
-      </w:r>
-    </w:p>
-    <w:p>
-      <w:r>
-        <w:t xml:space="preserve">|     25     | [5 2 2]  4.1723994838580215e-05 </w:t>
-      </w:r>
-    </w:p>
-    <w:p>
-      <w:r>
-        <w:t xml:space="preserve">|     26     | [6 2 1]   3.34658214665098e-05  </w:t>
-      </w:r>
-    </w:p>
-    <w:p>
-      <w:r>
-        <w:t xml:space="preserve">|     27     | [6 2 2]  0.00016972488878615698 </w:t>
-      </w:r>
-    </w:p>
-    <w:p>
-      <w:r>
-        <w:t xml:space="preserve">|     28     | [7 2 1]  0.0001734102287709947  </w:t>
-      </w:r>
-    </w:p>
-    <w:p>
-      <w:r>
+        <w:drawing>
+          <wp:inline distT="0" distB="0" distL="0" distR="0" wp14:anchorId="57B6B175" wp14:editId="16C2CD04">
+            <wp:extent cx="4926984" cy="4761905"/>
+            <wp:effectExtent l="0" t="0" r="6985" b="635"/>
+            <wp:docPr id="282892055" name="图片 1"/>
+            <wp:cNvGraphicFramePr>
+              <a:graphicFrameLocks xmlns:a="http://schemas.openxmlformats.org/drawingml/2006/main" noChangeAspect="1"/>
+            </wp:cNvGraphicFramePr>
+            <a:graphic xmlns:a="http://schemas.openxmlformats.org/drawingml/2006/main">
+              <a:graphicData uri="http://schemas.openxmlformats.org/drawingml/2006/picture">
+                <pic:pic xmlns:pic="http://schemas.openxmlformats.org/drawingml/2006/picture">
+                  <pic:nvPicPr>
+                    <pic:cNvPr id="282892055" name=""/>
+                    <pic:cNvPicPr/>
+                  </pic:nvPicPr>
+                  <pic:blipFill>
+                    <a:blip r:embed="rId20"/>
+                    <a:stretch>
+                      <a:fillRect/>
+                    </a:stretch>
+                  </pic:blipFill>
+                  <pic:spPr>
+                    <a:xfrm>
+                      <a:off x="0" y="0"/>
+                      <a:ext cx="4926984" cy="4761905"/>
+                    </a:xfrm>
+                    <a:prstGeom prst="rect">
+                      <a:avLst/>
+                    </a:prstGeom>
+                  </pic:spPr>
+                </pic:pic>
+              </a:graphicData>
+            </a:graphic>
+          </wp:inline>
+        </w:drawing>
+      </w:r>
+    </w:p>
+    <w:p>
+      <w:r>
+        <w:t xml:space="preserve">This </w:t>
+      </w:r>
+      <w:r>
+        <w:rPr>
+          <w:rFonts w:hint="eastAsia"/>
+        </w:rPr>
+        <w:t>above graph is v_core at 6.5, y_same as last one</w:t>
+      </w:r>
+    </w:p>
+    <w:p/>
+    <w:p/>
+    <w:p>
+      <w:r>
+        <w:t>TO THE NEXT PAGE</w:t>
+      </w:r>
+    </w:p>
+    <w:p/>
+    <w:p/>
+    <w:p/>
+    <w:p/>
+    <w:p/>
+    <w:p/>
+    <w:p/>
+    <w:p/>
+    <w:p/>
+    <w:p/>
+    <w:p>
+      <w:r>
+        <w:t xml:space="preserve">Now shift the vortex core at (5, 4, 2), real coords: x= </w:t>
+      </w:r>
+      <w:r>
+        <w:t xml:space="preserve">6 , </w:t>
+      </w:r>
+      <w:r>
+        <w:t xml:space="preserve">y= </w:t>
+      </w:r>
+      <w:r>
+        <w:t>5* (np.sqrt(3)/3),</w:t>
+      </w:r>
+      <w:r>
+        <w:t xml:space="preserve"> which should be on site. Parameter still at resonant point determined above next. Below: It doesn’t look good because this is inserted on site, not in the middle. The resonance is broken.</w:t>
+      </w:r>
+    </w:p>
+    <w:p/>
+    <w:p>
+      <w:r>
+        <w:rPr>
+          <w:noProof/>
+        </w:rPr>
+        <w:drawing>
+          <wp:inline distT="0" distB="0" distL="0" distR="0" wp14:anchorId="09012F17" wp14:editId="31B99B44">
+            <wp:extent cx="3365566" cy="2826327"/>
+            <wp:effectExtent l="0" t="0" r="6350" b="0"/>
+            <wp:docPr id="1861059038" name="图片 1"/>
+            <wp:cNvGraphicFramePr>
+              <a:graphicFrameLocks xmlns:a="http://schemas.openxmlformats.org/drawingml/2006/main" noChangeAspect="1"/>
+            </wp:cNvGraphicFramePr>
+            <a:graphic xmlns:a="http://schemas.openxmlformats.org/drawingml/2006/main">
+              <a:graphicData uri="http://schemas.openxmlformats.org/drawingml/2006/picture">
+                <pic:pic xmlns:pic="http://schemas.openxmlformats.org/drawingml/2006/picture">
+                  <pic:nvPicPr>
+                    <pic:cNvPr id="1861059038" name=""/>
+                    <pic:cNvPicPr/>
+                  </pic:nvPicPr>
+                  <pic:blipFill>
+                    <a:blip r:embed="rId21"/>
+                    <a:stretch>
+                      <a:fillRect/>
+                    </a:stretch>
+                  </pic:blipFill>
+                  <pic:spPr>
+                    <a:xfrm>
+                      <a:off x="0" y="0"/>
+                      <a:ext cx="3383938" cy="2841755"/>
+                    </a:xfrm>
+                    <a:prstGeom prst="rect">
+                      <a:avLst/>
+                    </a:prstGeom>
+                  </pic:spPr>
+                </pic:pic>
+              </a:graphicData>
+            </a:graphic>
+          </wp:inline>
+        </w:drawing>
+      </w:r>
+    </w:p>
+    <w:p/>
+    <w:p>
+      <w:r>
+        <w:t xml:space="preserve">While the same parameter of the bulk Hamiltonian(resonance), but the vortex core is moved to be at the central plaquette, while the Rho and nearest six sites epsilon </w:t>
+      </w:r>
+      <w:r>
+        <w:t xml:space="preserve">are </w:t>
+      </w:r>
+      <w:r>
+        <w:t>printed as below:</w:t>
+      </w:r>
+    </w:p>
+    <w:p>
+      <w:r>
+        <w:rPr>
+          <w:noProof/>
+        </w:rPr>
         <w:lastRenderedPageBreak/>
-        <w:t xml:space="preserve">|     29     | [7 2 2]  5.407192052654433e-05  </w:t>
-      </w:r>
-    </w:p>
-    <w:p>
-      <w:r>
-        <w:t xml:space="preserve">|     30     | [8 2 1]   0.08850827809265685   </w:t>
-      </w:r>
-    </w:p>
-    <w:p>
-      <w:r>
-        <w:t xml:space="preserve">|     31     | [8 2 2]   0.004022396303953474  </w:t>
-      </w:r>
-    </w:p>
-    <w:p>
-      <w:r>
-        <w:t xml:space="preserve">|     32     | [1 3 1]  2.2925425207340598e-05 </w:t>
-      </w:r>
-    </w:p>
-    <w:p>
-      <w:r>
-        <w:t xml:space="preserve">|     33     | [1 3 2]   0.09029737127367615   </w:t>
-      </w:r>
-    </w:p>
-    <w:p>
-      <w:r>
-        <w:t xml:space="preserve">|     34     | [2 3 1]  5.099045742915306e-07  </w:t>
-      </w:r>
-    </w:p>
-    <w:p>
-      <w:r>
-        <w:t xml:space="preserve">|     35     | [2 3 2]   0.001799986062956309  </w:t>
-      </w:r>
-    </w:p>
-    <w:p>
-      <w:r>
-        <w:t xml:space="preserve">|     36     | [3 3 1]  0.00010007164976226995 </w:t>
-      </w:r>
-    </w:p>
-    <w:p>
-      <w:r>
-        <w:t xml:space="preserve">|     37     | [3 3 2]  8.828114723932214e-05  </w:t>
-      </w:r>
-    </w:p>
-    <w:p>
-      <w:r>
-        <w:t xml:space="preserve">|     38     | [4 3 1]   6.48079832142115e-05  </w:t>
-      </w:r>
-    </w:p>
-    <w:p>
-      <w:r>
-        <w:t xml:space="preserve">|     39     | [4 3 2]  2.7227200219036834e-05 </w:t>
-      </w:r>
-    </w:p>
-    <w:p>
-      <w:r>
-        <w:t xml:space="preserve">|     40     | [5 3 1]  7.924179378909734e-06  </w:t>
-      </w:r>
-    </w:p>
-    <w:p>
-      <w:r>
-        <w:t xml:space="preserve">|     41     | [5 3 2]   0.003727382318842995  </w:t>
-      </w:r>
-    </w:p>
-    <w:p>
-      <w:r>
-        <w:t xml:space="preserve">|     42     | [6 3 1]  8.604957776682664e-05  </w:t>
-      </w:r>
-    </w:p>
-    <w:p>
-      <w:r>
-        <w:t xml:space="preserve">|     43     | [6 3 2]   0.008286630223900127  </w:t>
-      </w:r>
-    </w:p>
-    <w:p>
-      <w:r>
-        <w:t xml:space="preserve">|     44     | [7 3 1]  0.0034678066493582056  </w:t>
-      </w:r>
-    </w:p>
-    <w:p>
-      <w:r>
-        <w:t xml:space="preserve">|     45     | [7 3 2]  0.0003263904886020482  </w:t>
-      </w:r>
-    </w:p>
-    <w:p>
-      <w:r>
-        <w:t xml:space="preserve">|     46     | [8 3 1]    0.087439875951513    </w:t>
-      </w:r>
-    </w:p>
-    <w:p>
-      <w:r>
-        <w:t xml:space="preserve">|     47     | [8 3 2]   0.003686166546031429  </w:t>
-      </w:r>
-    </w:p>
-    <w:p>
-      <w:r>
-        <w:t xml:space="preserve">|     48     | [1 4 1]  8.445381256989571e-05  </w:t>
-      </w:r>
-    </w:p>
-    <w:p>
-      <w:r>
-        <w:t xml:space="preserve">|     49     | [1 4 2]   0.09456447769143465   </w:t>
-      </w:r>
-    </w:p>
-    <w:p>
-      <w:r>
-        <w:t xml:space="preserve">|     50     | [2 4 1]  9.070776671943265e-05  </w:t>
-      </w:r>
-    </w:p>
-    <w:p>
-      <w:r>
-        <w:t xml:space="preserve">|     51     | [2 4 2]  9.850486342145197e-05  </w:t>
-      </w:r>
-    </w:p>
-    <w:p>
-      <w:r>
-        <w:t xml:space="preserve">|     52     | [3 4 1]   0.006060307777975265  </w:t>
-      </w:r>
-    </w:p>
-    <w:p>
-      <w:r>
-        <w:t xml:space="preserve">|     53     | [3 4 2]  3.280005890767215e-06  </w:t>
-      </w:r>
-    </w:p>
-    <w:p>
-      <w:r>
-        <w:t xml:space="preserve">|     54     | [4 4 1]   0.00536196131613442   </w:t>
-      </w:r>
-    </w:p>
-    <w:p>
-      <w:r>
-        <w:t xml:space="preserve">|     55     | [4 4 2]  6.615231484101325e-06  </w:t>
-      </w:r>
-    </w:p>
-    <w:p>
-      <w:r>
-        <w:t xml:space="preserve">|     56     | [5 4 1]   0.006179167494790859  </w:t>
+        <w:drawing>
+          <wp:inline distT="0" distB="0" distL="0" distR="0" wp14:anchorId="03F63928" wp14:editId="17FB71F3">
+            <wp:extent cx="4926984" cy="3580952"/>
+            <wp:effectExtent l="0" t="0" r="6985" b="635"/>
+            <wp:docPr id="1200193096" name="图片 1"/>
+            <wp:cNvGraphicFramePr>
+              <a:graphicFrameLocks xmlns:a="http://schemas.openxmlformats.org/drawingml/2006/main" noChangeAspect="1"/>
+            </wp:cNvGraphicFramePr>
+            <a:graphic xmlns:a="http://schemas.openxmlformats.org/drawingml/2006/main">
+              <a:graphicData uri="http://schemas.openxmlformats.org/drawingml/2006/picture">
+                <pic:pic xmlns:pic="http://schemas.openxmlformats.org/drawingml/2006/picture">
+                  <pic:nvPicPr>
+                    <pic:cNvPr id="1200193096" name=""/>
+                    <pic:cNvPicPr/>
+                  </pic:nvPicPr>
+                  <pic:blipFill>
+                    <a:blip r:embed="rId22"/>
+                    <a:stretch>
+                      <a:fillRect/>
+                    </a:stretch>
+                  </pic:blipFill>
+                  <pic:spPr>
+                    <a:xfrm>
+                      <a:off x="0" y="0"/>
+                      <a:ext cx="4926984" cy="3580952"/>
+                    </a:xfrm>
+                    <a:prstGeom prst="rect">
+                      <a:avLst/>
+                    </a:prstGeom>
+                  </pic:spPr>
+                </pic:pic>
+              </a:graphicData>
+            </a:graphic>
+          </wp:inline>
+        </w:drawing>
+      </w:r>
+    </w:p>
+    <w:p/>
+    <w:p>
+      <w:r>
+        <w:t xml:space="preserve">       Epsilon        |          Rho           </w:t>
+      </w:r>
+    </w:p>
+    <w:p>
+      <w:r>
+        <w:t>--------------------------------------------------------</w:t>
+      </w:r>
+    </w:p>
+    <w:p>
+      <w:r>
+        <w:t xml:space="preserve">  -3.141554789785627  |  0.48013502037425965   </w:t>
+      </w:r>
+    </w:p>
+    <w:p>
+      <w:r>
+        <w:t xml:space="preserve"> -2.9399109246419894  | 1.1142689430728609e-07 </w:t>
+      </w:r>
+    </w:p>
+    <w:p>
+      <w:r>
+        <w:t xml:space="preserve">  -2.738491857140014  | 3.939326479663634e-07  </w:t>
+      </w:r>
+    </w:p>
+    <w:p>
+      <w:r>
+        <w:t xml:space="preserve">  -2.53774323580421   | 6.561489697324576e-07  </w:t>
+      </w:r>
+    </w:p>
+    <w:p>
+      <w:r>
+        <w:t xml:space="preserve">  -2.338491182241252  | 1.040465418747468e-06  </w:t>
+      </w:r>
+    </w:p>
+    <w:p>
+      <w:r>
+        <w:t xml:space="preserve"> -2.1427487875332427  | 1.6075538375489414e-05 </w:t>
+      </w:r>
+    </w:p>
+    <w:p>
+      <w:r>
+        <w:t xml:space="preserve"> -1.9567345931019007  | 0.0002875887147468085  </w:t>
+      </w:r>
+    </w:p>
+    <w:p>
+      <w:r>
+        <w:t xml:space="preserve"> -1.8277556686873775  |  0.06984994327354518   </w:t>
+      </w:r>
+    </w:p>
+    <w:p>
+      <w:r>
+        <w:t xml:space="preserve"> -1.8196079057865593  |  0.06789177558362018   </w:t>
+      </w:r>
+    </w:p>
+    <w:p>
+      <w:r>
+        <w:t xml:space="preserve"> -1.8070093560737115  |  0.010248078989495216  </w:t>
+      </w:r>
+    </w:p>
+    <w:p>
+      <w:r>
+        <w:t xml:space="preserve"> -1.8054251821603298  |  0.07713702840110778   </w:t>
+      </w:r>
+    </w:p>
+    <w:p>
+      <w:r>
+        <w:t xml:space="preserve"> -1.7862816156013799  |  0.05288581525658412   </w:t>
+      </w:r>
+    </w:p>
+    <w:p>
+      <w:r>
+        <w:t xml:space="preserve"> -1.7716037744776516  |  0.018870639371264982  </w:t>
       </w:r>
     </w:p>
     <w:p>
       <w:r>
         <w:lastRenderedPageBreak/>
-        <w:t xml:space="preserve">|     57     | [5 4 2]    0.9245808481140427   </w:t>
-      </w:r>
-    </w:p>
-    <w:p>
-      <w:r>
-        <w:t xml:space="preserve">|     58     | [6 4 1]  0.0015501947099785633  </w:t>
-      </w:r>
-    </w:p>
-    <w:p>
-      <w:r>
-        <w:t xml:space="preserve">|     59     | [6 4 2]   0.004594718727442413  </w:t>
-      </w:r>
-    </w:p>
-    <w:p>
-      <w:r>
-        <w:t xml:space="preserve">|     60     | [7 4 1]  0.0008869792444805353  </w:t>
-      </w:r>
-    </w:p>
-    <w:p>
-      <w:r>
-        <w:t xml:space="preserve">|     61     | [7 4 2]  0.0020222056566376444  </w:t>
-      </w:r>
-    </w:p>
-    <w:p>
-      <w:r>
-        <w:t xml:space="preserve">|     62     | [8 4 1]   0.02427423226686124   </w:t>
-      </w:r>
-    </w:p>
-    <w:p>
-      <w:r>
-        <w:t xml:space="preserve">|     63     | [8 4 2]   0.07085445246074322   </w:t>
-      </w:r>
-    </w:p>
-    <w:p>
-      <w:r>
-        <w:t xml:space="preserve">|     64     | [1 5 1]  0.0027335181119137893  </w:t>
-      </w:r>
-    </w:p>
-    <w:p>
-      <w:r>
-        <w:t xml:space="preserve">|     65     | [1 5 2]   0.09509855611493445   </w:t>
-      </w:r>
-    </w:p>
-    <w:p>
-      <w:r>
-        <w:t xml:space="preserve">|     66     | [2 5 1]  0.0003004129553400307  </w:t>
-      </w:r>
-    </w:p>
-    <w:p>
-      <w:r>
-        <w:t xml:space="preserve">|     67     | [2 5 2]  0.00013152445307781832 </w:t>
-      </w:r>
-    </w:p>
-    <w:p>
-      <w:r>
-        <w:t xml:space="preserve">|     68     | [3 5 1]   0.00803173010874077   </w:t>
-      </w:r>
-    </w:p>
-    <w:p>
-      <w:r>
-        <w:t xml:space="preserve">|     69     | [3 5 2]  4.935511114249082e-05  </w:t>
-      </w:r>
-    </w:p>
-    <w:p>
-      <w:r>
-        <w:t xml:space="preserve">|     70     | [4 5 1]   0.010605045906855442  </w:t>
-      </w:r>
-    </w:p>
-    <w:p>
-      <w:r>
-        <w:t xml:space="preserve">|     71     | [4 5 2]  0.0040168537057828895  </w:t>
-      </w:r>
-    </w:p>
-    <w:p>
-      <w:r>
-        <w:t xml:space="preserve">|     72     | [5 5 1]   0.003628450878483168  </w:t>
-      </w:r>
-    </w:p>
-    <w:p>
-      <w:r>
-        <w:t xml:space="preserve">|     73     | [5 5 2]   0.007705636645604455  </w:t>
-      </w:r>
-    </w:p>
-    <w:p>
-      <w:r>
-        <w:t xml:space="preserve">|     74     | [6 5 1]  0.0001253335212285656  </w:t>
-      </w:r>
-    </w:p>
-    <w:p>
-      <w:r>
-        <w:t xml:space="preserve">|     75     | [6 5 2]  6.312785409928043e-05  </w:t>
-      </w:r>
-    </w:p>
-    <w:p>
-      <w:r>
-        <w:t xml:space="preserve">|     76     | [7 5 1]  4.043217845197785e-06  </w:t>
-      </w:r>
-    </w:p>
-    <w:p>
-      <w:r>
-        <w:t xml:space="preserve">|     77     | [7 5 2]  0.0001147367537336606  </w:t>
-      </w:r>
-    </w:p>
-    <w:p>
-      <w:r>
-        <w:t xml:space="preserve">|     78     | [8 5 1]  0.0026501463201317197  </w:t>
-      </w:r>
-    </w:p>
-    <w:p>
-      <w:r>
-        <w:t xml:space="preserve">|     79     | [8 5 2]   0.09197883327450565   </w:t>
-      </w:r>
-    </w:p>
-    <w:p>
-      <w:r>
-        <w:t xml:space="preserve">|     80     | [1 6 1]   0.002640372588326564  </w:t>
-      </w:r>
-    </w:p>
-    <w:p>
-      <w:r>
-        <w:t xml:space="preserve">|     81     | [1 6 2]    0.0892325359907152   </w:t>
-      </w:r>
-    </w:p>
-    <w:p>
-      <w:r>
-        <w:t xml:space="preserve">|     82     | [2 6 1]  6.600211090805993e-05  </w:t>
-      </w:r>
-    </w:p>
-    <w:p>
-      <w:r>
-        <w:t xml:space="preserve">|     83     | [2 6 2]  0.0027209405678577576  </w:t>
-      </w:r>
-    </w:p>
-    <w:p>
-      <w:r>
-        <w:t xml:space="preserve">|     84     | [3 6 1]  5.109985173813719e-05  </w:t>
+        <w:t xml:space="preserve"> -1.7688885885864698  |  0.10413762416686535   </w:t>
+      </w:r>
+    </w:p>
+    <w:p>
+      <w:r>
+        <w:t xml:space="preserve">  -1.761265260228808  |  0.06736263906919114   </w:t>
+      </w:r>
+    </w:p>
+    <w:p>
+      <w:r>
+        <w:t xml:space="preserve"> -1.7385918674396041  |  0.034617934639512946  </w:t>
+      </w:r>
+    </w:p>
+    <w:p>
+      <w:r>
+        <w:t xml:space="preserve"> -1.7303955637093227  |  0.014534409233001287  </w:t>
+      </w:r>
+    </w:p>
+    <w:p>
+      <w:r>
+        <w:t xml:space="preserve">  -1.725498251168523  |  0.03254794961675347   </w:t>
+      </w:r>
+    </w:p>
+    <w:p>
+      <w:r>
+        <w:t xml:space="preserve">  -1.71724774643817   | 0.0011841032103671303  </w:t>
+      </w:r>
+    </w:p>
+    <w:p>
+      <w:r>
+        <w:t xml:space="preserve"> -1.7156653194726457  |  0.029583654843665073  </w:t>
+      </w:r>
+    </w:p>
+    <w:p>
+      <w:r>
+        <w:t xml:space="preserve"> -1.7000321202806612  |  0.06649347130944151   </w:t>
+      </w:r>
+    </w:p>
+    <w:p>
+      <w:r>
+        <w:t xml:space="preserve">  -1.688801848616966  |  0.03743524039859625   </w:t>
+      </w:r>
+    </w:p>
+    <w:p>
+      <w:r>
+        <w:t xml:space="preserve"> -1.6821652365007485  |  0.11357566843000429   </w:t>
+      </w:r>
+    </w:p>
+    <w:p>
+      <w:r>
+        <w:t xml:space="preserve"> -1.6569494633660262  |  0.027771933049031805  </w:t>
+      </w:r>
+    </w:p>
+    <w:p>
+      <w:r>
+        <w:t xml:space="preserve">  -1.648580552338472  |   0.0167393307474198   </w:t>
+      </w:r>
+    </w:p>
+    <w:p>
+      <w:r>
+        <w:t xml:space="preserve">  -1.637487200406336  |  0.009370568798935322  </w:t>
+      </w:r>
+    </w:p>
+    <w:p>
+      <w:r>
+        <w:t xml:space="preserve"> -1.6340437298561172  |  0.022766435131335354  </w:t>
+      </w:r>
+    </w:p>
+    <w:p>
+      <w:r>
+        <w:t xml:space="preserve"> -1.6198515931025368  |  0.03574265233926315   </w:t>
+      </w:r>
+    </w:p>
+    <w:p>
+      <w:r>
+        <w:t xml:space="preserve"> -1.6108207166207875  |   0.0478289213788827   </w:t>
+      </w:r>
+    </w:p>
+    <w:p>
+      <w:r>
+        <w:t xml:space="preserve"> -1.6086652479004915  |  0.040264340602151255  </w:t>
+      </w:r>
+    </w:p>
+    <w:p>
+      <w:r>
+        <w:t xml:space="preserve"> -1.6026513306173955  |  0.03350940568321463   </w:t>
+      </w:r>
+    </w:p>
+    <w:p>
+      <w:r>
+        <w:t xml:space="preserve"> -1.5894508216235756  |  0.01293121711905911   </w:t>
+      </w:r>
+    </w:p>
+    <w:p>
+      <w:r>
+        <w:t xml:space="preserve">  -1.576417507027031  |  0.060918347177666844  </w:t>
+      </w:r>
+    </w:p>
+    <w:p>
+      <w:r>
+        <w:t xml:space="preserve">  -1.574768528395193  |  0.012792720105640224  </w:t>
+      </w:r>
+    </w:p>
+    <w:p>
+      <w:r>
+        <w:t xml:space="preserve"> -1.5692317451701063  |  0.11319542294968901   </w:t>
+      </w:r>
+    </w:p>
+    <w:p>
+      <w:r>
+        <w:t xml:space="preserve"> -1.5675093795468642  |  0.03463086067540467   </w:t>
+      </w:r>
+    </w:p>
+    <w:p>
+      <w:r>
+        <w:t xml:space="preserve">  -1.553215135915508  |  0.07690989106089466   </w:t>
+      </w:r>
+    </w:p>
+    <w:p>
+      <w:r>
+        <w:t xml:space="preserve"> -1.5460779822260242  |  0.08405221990083235   </w:t>
+      </w:r>
+    </w:p>
+    <w:p>
+      <w:r>
+        <w:t xml:space="preserve"> -1.5413322172637625  |  0.08159877790589783   </w:t>
+      </w:r>
+    </w:p>
+    <w:p>
+      <w:r>
+        <w:t xml:space="preserve">  -1.519851272288535  |  0.059012669678574395  </w:t>
+      </w:r>
+    </w:p>
+    <w:p>
+      <w:r>
+        <w:t xml:space="preserve"> -1.5064227830776407  |  0.048437082414989084  </w:t>
       </w:r>
     </w:p>
     <w:p>
       <w:r>
         <w:lastRenderedPageBreak/>
-        <w:t xml:space="preserve">|     85     | [3 6 2]  0.00034643795546080157 </w:t>
-      </w:r>
-    </w:p>
-    <w:p>
-      <w:r>
-        <w:t xml:space="preserve">|     86     | [4 6 1]  0.00015175772028828258 </w:t>
-      </w:r>
-    </w:p>
-    <w:p>
-      <w:r>
-        <w:t xml:space="preserve">|     87     | [4 6 2]  0.0035835487779337294  </w:t>
-      </w:r>
-    </w:p>
-    <w:p>
-      <w:r>
-        <w:t xml:space="preserve">|     88     | [5 6 1]  4.269697990486099e-05  </w:t>
-      </w:r>
-    </w:p>
-    <w:p>
-      <w:r>
-        <w:t xml:space="preserve">|     89     | [5 6 2]  0.0001458524515053506  </w:t>
-      </w:r>
-    </w:p>
-    <w:p>
-      <w:r>
-        <w:t xml:space="preserve">|     90     | [6 6 1]  3.8871927200543165e-06 </w:t>
-      </w:r>
-    </w:p>
-    <w:p>
-      <w:r>
-        <w:t xml:space="preserve">|     91     | [6 6 2]  6.072279083077232e-07  </w:t>
-      </w:r>
-    </w:p>
-    <w:p>
-      <w:r>
-        <w:t xml:space="preserve">|     92     | [7 6 1]  0.00010196048101673468 </w:t>
-      </w:r>
-    </w:p>
-    <w:p>
-      <w:r>
-        <w:t xml:space="preserve">|     93     | [7 6 2]   9.4971550150546e-05   </w:t>
-      </w:r>
-    </w:p>
-    <w:p>
-      <w:r>
-        <w:t xml:space="preserve">|     94     | [8 6 1]  7.394796713242112e-05  </w:t>
-      </w:r>
-    </w:p>
-    <w:p>
-      <w:r>
-        <w:t xml:space="preserve">|     95     | [8 6 2]   0.09193725679651128   </w:t>
-      </w:r>
-    </w:p>
-    <w:p>
-      <w:r>
-        <w:t xml:space="preserve">|     96     | [1 7 1]  0.0006117118417023899  </w:t>
-      </w:r>
-    </w:p>
-    <w:p>
-      <w:r>
-        <w:t xml:space="preserve">|     97     | [1 7 2]   0.08850827809265423   </w:t>
-      </w:r>
-    </w:p>
-    <w:p>
-      <w:r>
-        <w:t xml:space="preserve">|     98     | [2 7 1]  1.4157228413396655e-05 </w:t>
-      </w:r>
-    </w:p>
-    <w:p>
-      <w:r>
-        <w:t xml:space="preserve">|     99     | [2 7 2]  0.0035840946910219284  </w:t>
-      </w:r>
-    </w:p>
-    <w:p>
-      <w:r>
-        <w:t xml:space="preserve">|     100    | [3 7 1]  3.155657238138246e-05  </w:t>
-      </w:r>
-    </w:p>
-    <w:p>
-      <w:r>
-        <w:t xml:space="preserve">|     101    | [3 7 2]  0.00021342442600092088 </w:t>
-      </w:r>
-    </w:p>
-    <w:p>
-      <w:r>
-        <w:t xml:space="preserve">|     102    | [4 7 1]  2.310436721139858e-05  </w:t>
-      </w:r>
-    </w:p>
-    <w:p>
-      <w:r>
-        <w:t xml:space="preserve">|     103    | [4 7 2]  4.4320849576975755e-05 </w:t>
-      </w:r>
-    </w:p>
-    <w:p>
-      <w:r>
-        <w:t xml:space="preserve">|     104    | [5 7 1]   0.00271209337956437   </w:t>
-      </w:r>
-    </w:p>
-    <w:p>
-      <w:r>
-        <w:t xml:space="preserve">|     105    | [5 7 2]  1.5734612384484816e-06 </w:t>
-      </w:r>
-    </w:p>
-    <w:p>
-      <w:r>
-        <w:t xml:space="preserve">|     106    | [6 7 1]   0.002285019873591741  </w:t>
-      </w:r>
-    </w:p>
-    <w:p>
-      <w:r>
-        <w:t xml:space="preserve">|     107    | [6 7 2]  8.512143175081968e-05  </w:t>
-      </w:r>
-    </w:p>
-    <w:p>
-      <w:r>
-        <w:t xml:space="preserve">|     108    | [7 7 1]   0.002503874845156266  </w:t>
-      </w:r>
-    </w:p>
-    <w:p>
-      <w:r>
-        <w:t xml:space="preserve">|     109    | [7 7 2]  0.0017266049881500824  </w:t>
-      </w:r>
-    </w:p>
-    <w:p>
-      <w:r>
-        <w:t xml:space="preserve">|     110    | [8 7 1]  8.135957589266121e-05  </w:t>
-      </w:r>
-    </w:p>
-    <w:p>
-      <w:r>
-        <w:t xml:space="preserve">|     111    | [8 7 2]   0.09326855911358391   </w:t>
-      </w:r>
-    </w:p>
-    <w:p>
-      <w:r>
-        <w:t xml:space="preserve">|     112    | [1 8 1]   0.09307312905978377   </w:t>
+        <w:t xml:space="preserve"> -1.4994567163640096  |  0.10273882898788819   </w:t>
+      </w:r>
+    </w:p>
+    <w:p>
+      <w:r>
+        <w:t xml:space="preserve"> -1.4629843748981524  |  0.06259166143098391   </w:t>
+      </w:r>
+    </w:p>
+    <w:p>
+      <w:r>
+        <w:t xml:space="preserve"> -1.4544393330850294  |  0.07823621569456887   </w:t>
+      </w:r>
+    </w:p>
+    <w:p>
+      <w:r>
+        <w:t xml:space="preserve"> -1.4381658883897155  |  0.10940774603195844   </w:t>
+      </w:r>
+    </w:p>
+    <w:p>
+      <w:r>
+        <w:t xml:space="preserve"> -1.4294878711958763  |  0.01733488018377683   </w:t>
+      </w:r>
+    </w:p>
+    <w:p>
+      <w:r>
+        <w:t xml:space="preserve"> -1.4183828464782675  |  0.022401526359359422  </w:t>
+      </w:r>
+    </w:p>
+    <w:p>
+      <w:r>
+        <w:t xml:space="preserve">  -1.390182410181114  |  0.11138151047858685   </w:t>
+      </w:r>
+    </w:p>
+    <w:p>
+      <w:r>
+        <w:t xml:space="preserve"> -1.3868479504948863  |  0.07991544243395836   </w:t>
+      </w:r>
+    </w:p>
+    <w:p>
+      <w:r>
+        <w:t xml:space="preserve"> -1.3619365408041024  |  0.008470068602808745  </w:t>
+      </w:r>
+    </w:p>
+    <w:p>
+      <w:r>
+        <w:t xml:space="preserve"> -1.3583948752423174  |  0.04835790672243831   </w:t>
+      </w:r>
+    </w:p>
+    <w:p>
+      <w:r>
+        <w:t xml:space="preserve"> -1.3538865850642492  |  0.036671653055795096  </w:t>
+      </w:r>
+    </w:p>
+    <w:p>
+      <w:r>
+        <w:t xml:space="preserve">  -1.341169308049616  |  0.049236218378416144  </w:t>
+      </w:r>
+    </w:p>
+    <w:p>
+      <w:r>
+        <w:t xml:space="preserve"> -1.3212663494258812  |  0.07235503017866035   </w:t>
+      </w:r>
+    </w:p>
+    <w:p>
+      <w:r>
+        <w:t xml:space="preserve"> -1.3186130097388973  |  0.02742553346604638   </w:t>
+      </w:r>
+    </w:p>
+    <w:p>
+      <w:r>
+        <w:t xml:space="preserve"> -1.3079803321449324  |  0.05932321504996169   </w:t>
+      </w:r>
+    </w:p>
+    <w:p>
+      <w:r>
+        <w:t xml:space="preserve"> -1.3015044450399063  |  0.01590306722952744   </w:t>
+      </w:r>
+    </w:p>
+    <w:p>
+      <w:r>
+        <w:t xml:space="preserve"> -1.2251964241473616  | 0.0008969487231930354  </w:t>
+      </w:r>
+    </w:p>
+    <w:p>
+      <w:r>
+        <w:t xml:space="preserve">  -1.056667743874648  | 6.196023296971303e-05  </w:t>
+      </w:r>
+    </w:p>
+    <w:p>
+      <w:r>
+        <w:t xml:space="preserve"> -0.8682839638569982  | 1.3949699477871947e-05 </w:t>
+      </w:r>
+    </w:p>
+    <w:p>
+      <w:r>
+        <w:t xml:space="preserve"> -0.6757652043898936  | 4.454540961490612e-06  </w:t>
+      </w:r>
+    </w:p>
+    <w:p>
+      <w:r>
+        <w:t xml:space="preserve"> -0.4824313535569138  | 1.5567104889377449e-06 </w:t>
+      </w:r>
+    </w:p>
+    <w:p>
+      <w:r>
+        <w:t xml:space="preserve"> -0.28924310435732026 | 6.534527164818793e-07  </w:t>
+      </w:r>
+    </w:p>
+    <w:p>
+      <w:r>
+        <w:t xml:space="preserve"> -0.09636813388206132 | 3.1325138119165514e-07 </w:t>
+      </w:r>
+    </w:p>
+    <w:p>
+      <w:r>
+        <w:t xml:space="preserve"> 0.09636813388206059  | 3.132513811917184e-07  </w:t>
+      </w:r>
+    </w:p>
+    <w:p>
+      <w:r>
+        <w:t xml:space="preserve"> 0.28924310435731926  |  6.53452716481935e-07  </w:t>
+      </w:r>
+    </w:p>
+    <w:p>
+      <w:r>
+        <w:t xml:space="preserve">  0.4824313535569124  | 1.556710488937585e-06  </w:t>
+      </w:r>
+    </w:p>
+    <w:p>
+      <w:r>
+        <w:t xml:space="preserve">  0.6757652043898934  | 4.454540961489024e-06  </w:t>
+      </w:r>
+    </w:p>
+    <w:p>
+      <w:r>
+        <w:t xml:space="preserve">  0.8682839638569964  | 1.394969947787103e-05  </w:t>
       </w:r>
     </w:p>
     <w:p>
       <w:r>
         <w:lastRenderedPageBreak/>
-        <w:t xml:space="preserve">|     113    | [1 8 2]   0.09239051330773826   </w:t>
-      </w:r>
-    </w:p>
-    <w:p>
-      <w:r>
-        <w:t xml:space="preserve">|     114    | [2 8 1]   0.09493389732648086   </w:t>
-      </w:r>
-    </w:p>
-    <w:p>
-      <w:r>
-        <w:t xml:space="preserve">|     115    | [2 8 2]  0.00018868327090788422 </w:t>
-      </w:r>
-    </w:p>
-    <w:p>
-      <w:r>
-        <w:t xml:space="preserve">|     116    | [3 8 1]   0.09541789854318633   </w:t>
-      </w:r>
-    </w:p>
-    <w:p>
-      <w:r>
-        <w:t xml:space="preserve">|     117    | [3 8 2]  3.167561341783647e-05  </w:t>
-      </w:r>
-    </w:p>
-    <w:p>
-      <w:r>
-        <w:t xml:space="preserve">|     118    | [4 8 1]   0.08941492693475149   </w:t>
-      </w:r>
-    </w:p>
-    <w:p>
-      <w:r>
-        <w:t xml:space="preserve">|     119    | [4 8 2]   0.002729924796065771  </w:t>
-      </w:r>
-    </w:p>
-    <w:p>
-      <w:r>
-        <w:t xml:space="preserve">|     120    | [5 8 1]   0.08971217771475525   </w:t>
-      </w:r>
-    </w:p>
-    <w:p>
-      <w:r>
-        <w:t xml:space="preserve">|     121    | [5 8 2]  0.0016357678751079538  </w:t>
-      </w:r>
-    </w:p>
-    <w:p>
-      <w:r>
-        <w:t xml:space="preserve">|     122    | [6 8 1]   0.08999647924914889   </w:t>
-      </w:r>
-    </w:p>
-    <w:p>
-      <w:r>
-        <w:t xml:space="preserve">|     123    | [6 8 2]  0.0027474778643904823  </w:t>
-      </w:r>
-    </w:p>
-    <w:p>
-      <w:r>
-        <w:t xml:space="preserve">|     124    | [7 8 1]   0.09885963786478025   </w:t>
-      </w:r>
-    </w:p>
-    <w:p>
-      <w:r>
-        <w:t xml:space="preserve">|     125    | [7 8 2]  0.0014779198353957433  </w:t>
-      </w:r>
-    </w:p>
-    <w:p>
-      <w:r>
-        <w:t xml:space="preserve">|     126    | [8 8 1]    0.1258546386146429   </w:t>
-      </w:r>
-    </w:p>
-    <w:p>
-      <w:r>
-        <w:t xml:space="preserve">|     127    | [8 8 2]   0.09230077251248617   </w:t>
-      </w:r>
-    </w:p>
-    <w:p>
-      <w:r>
-        <w:t>[-3.14109911 -2.9489505   2.9489505   3.14109911]-------</w:t>
-      </w:r>
-    </w:p>
-    <w:p>
-      <w:r>
-        <w:t>4</w:t>
+        <w:t xml:space="preserve">  1.0566677438746475  | 6.196023296971022e-05  </w:t>
+      </w:r>
+    </w:p>
+    <w:p>
+      <w:r>
+        <w:t xml:space="preserve">  1.2251964241473603  | 0.0008969487231930524  </w:t>
+      </w:r>
+    </w:p>
+    <w:p>
+      <w:r>
+        <w:t xml:space="preserve">  1.3015044450399056  |  0.015903067229525635  </w:t>
+      </w:r>
+    </w:p>
+    <w:p>
+      <w:r>
+        <w:t xml:space="preserve">  1.3079803321449321  |  0.059323215049957946  </w:t>
+      </w:r>
+    </w:p>
+    <w:p>
+      <w:r>
+        <w:t xml:space="preserve">  1.318613009738898   |  0.027425533466042623  </w:t>
+      </w:r>
+    </w:p>
+    <w:p>
+      <w:r>
+        <w:t xml:space="preserve">  1.3212663494258814  |  0.07235503017866148   </w:t>
+      </w:r>
+    </w:p>
+    <w:p>
+      <w:r>
+        <w:t xml:space="preserve">  1.3411693080496159  |  0.049236218378418475  </w:t>
+      </w:r>
+    </w:p>
+    <w:p>
+      <w:r>
+        <w:t xml:space="preserve">  1.3538865850642492  |  0.03667165305579451   </w:t>
+      </w:r>
+    </w:p>
+    <w:p>
+      <w:r>
+        <w:t xml:space="preserve">  1.358394875242318   |   0.048357906722443    </w:t>
+      </w:r>
+    </w:p>
+    <w:p>
+      <w:r>
+        <w:t xml:space="preserve">  1.3619365408041033  |  0.008470068602809373  </w:t>
+      </w:r>
+    </w:p>
+    <w:p>
+      <w:r>
+        <w:t xml:space="preserve">  1.3868479504948854  |   0.0799154424339429   </w:t>
+      </w:r>
+    </w:p>
+    <w:p>
+      <w:r>
+        <w:t xml:space="preserve">  1.3901824101811149  |  0.11138151047859274   </w:t>
+      </w:r>
+    </w:p>
+    <w:p>
+      <w:r>
+        <w:t xml:space="preserve">  1.4183828464782668  |  0.022401526359358655  </w:t>
+      </w:r>
+    </w:p>
+    <w:p>
+      <w:r>
+        <w:t xml:space="preserve">  1.429487871195875   |  0.01733488018377947   </w:t>
+      </w:r>
+    </w:p>
+    <w:p>
+      <w:r>
+        <w:t xml:space="preserve">  1.438165888389715   |  0.10940774603196425   </w:t>
+      </w:r>
+    </w:p>
+    <w:p>
+      <w:r>
+        <w:t xml:space="preserve">  1.4544393330850298  |  0.07823621569456989   </w:t>
+      </w:r>
+    </w:p>
+    <w:p>
+      <w:r>
+        <w:t xml:space="preserve">  1.4629843748981526  |  0.06259166143098566   </w:t>
+      </w:r>
+    </w:p>
+    <w:p>
+      <w:r>
+        <w:t xml:space="preserve">   1.49945671636401   |   0.1027388289878981   </w:t>
+      </w:r>
+    </w:p>
+    <w:p>
+      <w:r>
+        <w:t xml:space="preserve">  1.5064227830776402  |  0.04843708241500441   </w:t>
+      </w:r>
+    </w:p>
+    <w:p>
+      <w:r>
+        <w:t xml:space="preserve">  1.519851272288534   |  0.05901266967857316   </w:t>
+      </w:r>
+    </w:p>
+    <w:p>
+      <w:r>
+        <w:t xml:space="preserve">  1.541332217263762   |   0.0815987779059092   </w:t>
+      </w:r>
+    </w:p>
+    <w:p>
+      <w:r>
+        <w:t xml:space="preserve">  1.5460779822260247  |  0.08405221990083828   </w:t>
+      </w:r>
+    </w:p>
+    <w:p>
+      <w:r>
+        <w:t xml:space="preserve">  1.553215135915508   |  0.07690989106088977   </w:t>
+      </w:r>
+    </w:p>
+    <w:p>
+      <w:r>
+        <w:t xml:space="preserve">  1.5675093795468646  |  0.03463086067539807   </w:t>
+      </w:r>
+    </w:p>
+    <w:p>
+      <w:r>
+        <w:t xml:space="preserve">  1.5692317451701059  |  0.11319542294967089   </w:t>
+      </w:r>
+    </w:p>
+    <w:p>
+      <w:r>
+        <w:t xml:space="preserve">  1.574768528395193   |  0.012792720105636089  </w:t>
+      </w:r>
+    </w:p>
+    <w:p>
+      <w:r>
+        <w:t xml:space="preserve">   1.57641750702703   |  0.06091834717765482   </w:t>
+      </w:r>
+    </w:p>
+    <w:p>
+      <w:r>
+        <w:t xml:space="preserve">  1.5894508216235756  |  0.012931217119059554  </w:t>
+      </w:r>
+    </w:p>
+    <w:p>
+      <w:r>
+        <w:lastRenderedPageBreak/>
+        <w:t xml:space="preserve">  1.602651330617395   |  0.03350940568320973   </w:t>
+      </w:r>
+    </w:p>
+    <w:p>
+      <w:r>
+        <w:t xml:space="preserve">  1.6086652479004913  |   0.0402643406021394   </w:t>
+      </w:r>
+    </w:p>
+    <w:p>
+      <w:r>
+        <w:t xml:space="preserve">  1.6108207166207875  |  0.047828921378876454  </w:t>
+      </w:r>
+    </w:p>
+    <w:p>
+      <w:r>
+        <w:t xml:space="preserve">  1.619851593102536   |  0.035742652339259225  </w:t>
+      </w:r>
+    </w:p>
+    <w:p>
+      <w:r>
+        <w:t xml:space="preserve">  1.634043729856117   |  0.02276643513133643   </w:t>
+      </w:r>
+    </w:p>
+    <w:p>
+      <w:r>
+        <w:t xml:space="preserve">  1.6374872004063366  |  0.00937056879893924   </w:t>
+      </w:r>
+    </w:p>
+    <w:p>
+      <w:r>
+        <w:t xml:space="preserve">  1.6485805523384718  |  0.016739330747423516  </w:t>
+      </w:r>
+    </w:p>
+    <w:p>
+      <w:r>
+        <w:t xml:space="preserve">  1.656949463366027   |  0.027771933049032395  </w:t>
+      </w:r>
+    </w:p>
+    <w:p>
+      <w:r>
+        <w:t xml:space="preserve">  1.6821652365007485  |  0.11357566843001239   </w:t>
+      </w:r>
+    </w:p>
+    <w:p>
+      <w:r>
+        <w:t xml:space="preserve">  1.6888018486169667  |  0.037435240398596976  </w:t>
+      </w:r>
+    </w:p>
+    <w:p>
+      <w:r>
+        <w:t xml:space="preserve">  1.7000321202806599  |  0.06649347130944315   </w:t>
+      </w:r>
+    </w:p>
+    <w:p>
+      <w:r>
+        <w:t xml:space="preserve">  1.715665319472645   |  0.029583654843663782  </w:t>
+      </w:r>
+    </w:p>
+    <w:p>
+      <w:r>
+        <w:t xml:space="preserve">  1.7172477464381695  | 0.0011841032103688204  </w:t>
+      </w:r>
+    </w:p>
+    <w:p>
+      <w:r>
+        <w:t xml:space="preserve">  1.7254982511685226  |  0.03254794961675078   </w:t>
+      </w:r>
+    </w:p>
+    <w:p>
+      <w:r>
+        <w:t xml:space="preserve">  1.7303955637093227  |  0.014534409232990961  </w:t>
+      </w:r>
+    </w:p>
+    <w:p>
+      <w:r>
+        <w:t xml:space="preserve">  1.738591867439604   |  0.03461793463949869   </w:t>
+      </w:r>
+    </w:p>
+    <w:p>
+      <w:r>
+        <w:t xml:space="preserve">  1.761265260228808   |  0.06736263906919623   </w:t>
+      </w:r>
+    </w:p>
+    <w:p>
+      <w:r>
+        <w:t xml:space="preserve">  1.7688885885864685  |  0.10413762416688642   </w:t>
+      </w:r>
+    </w:p>
+    <w:p>
+      <w:r>
+        <w:t xml:space="preserve">  1.7716037744776532  |  0.018870639371266346  </w:t>
+      </w:r>
+    </w:p>
+    <w:p>
+      <w:r>
+        <w:t xml:space="preserve">  1.7862816156013797  |  0.05288581525658339   </w:t>
+      </w:r>
+    </w:p>
+    <w:p>
+      <w:r>
+        <w:t xml:space="preserve">  1.8054251821603298  |  0.07713702840110717   </w:t>
+      </w:r>
+    </w:p>
+    <w:p>
+      <w:r>
+        <w:t xml:space="preserve">  1.8070093560737104  |  0.010248078989500057  </w:t>
+      </w:r>
+    </w:p>
+    <w:p>
+      <w:r>
+        <w:t xml:space="preserve">  1.8196079057865588  |  0.06789177558362675   </w:t>
+      </w:r>
+    </w:p>
+    <w:p>
+      <w:r>
+        <w:t xml:space="preserve">  1.827755668687378   |  0.06984994327355004   </w:t>
+      </w:r>
+    </w:p>
+    <w:p>
+      <w:r>
+        <w:t xml:space="preserve">  1.9567345931018991  | 0.0002875887147467853  </w:t>
+      </w:r>
+    </w:p>
+    <w:p>
+      <w:r>
+        <w:t xml:space="preserve">  2.1427487875332414  | 1.6075538375491243e-05 </w:t>
+      </w:r>
+    </w:p>
+    <w:p>
+      <w:r>
+        <w:t xml:space="preserve">  2.3384911822412517  | 1.040465418747325e-06  </w:t>
+      </w:r>
+    </w:p>
+    <w:p>
+      <w:r>
+        <w:t xml:space="preserve">  2.5377432358042085  |  6.56148969732932e-07  </w:t>
+      </w:r>
+    </w:p>
+    <w:p>
+      <w:r>
+        <w:lastRenderedPageBreak/>
+        <w:t xml:space="preserve">  2.738491857140013   | 3.9393264796651727e-07 </w:t>
+      </w:r>
+    </w:p>
+    <w:p>
+      <w:r>
+        <w:t xml:space="preserve">  2.939910924641989   | 1.1142689430734043e-07 </w:t>
+      </w:r>
+    </w:p>
+    <w:p>
+      <w:r>
+        <w:t xml:space="preserve">  3.141554789785628   |   0.4801350203615267   </w:t>
+      </w:r>
+    </w:p>
+    <w:p>
+      <w:r>
+        <w:t>--------------------------------------------------------</w:t>
       </w:r>
     </w:p>
     <w:sectPr>
@@ -4597,6 +6060,56 @@
     </w:sectPr>
   </w:body>
 </w:document>
+</file>
+
+<file path=word/endnotes.xml><?xml version="1.0" encoding="utf-8"?>
+<w:endnotes xmlns:wpc="http://schemas.microsoft.com/office/word/2010/wordprocessingCanvas" xmlns:cx="http://schemas.microsoft.com/office/drawing/2014/chartex" xmlns:cx1="http://schemas.microsoft.com/office/drawing/2015/9/8/chartex" xmlns:cx2="http://schemas.microsoft.com/office/drawing/2015/10/21/chartex" xmlns:cx3="http://schemas.microsoft.com/office/drawing/2016/5/9/chartex" xmlns:cx4="http://schemas.microsoft.com/office/drawing/2016/5/10/chartex" xmlns:cx5="http://schemas.microsoft.com/office/drawing/2016/5/11/chartex" xmlns:cx6="http://schemas.microsoft.com/office/drawing/2016/5/12/chartex" xmlns:cx7="http://schemas.microsoft.com/office/drawing/2016/5/13/chartex" xmlns:cx8="http://schemas.microsoft.com/office/drawing/2016/5/14/chartex" xmlns:mc="http://schemas.openxmlformats.org/markup-compatibility/2006" xmlns:aink="http://schemas.microsoft.com/office/drawing/2016/ink" xmlns:am3d="http://schemas.microsoft.com/office/drawing/2017/model3d" xmlns:o="urn:schemas-microsoft-com:office:office" xmlns:oel="http://schemas.microsoft.com/office/2019/extlst" xmlns:r="http://schemas.openxmlformats.org/officeDocument/2006/relationships" xmlns:m="http://schemas.openxmlformats.org/officeDocument/2006/math" xmlns:v="urn:schemas-microsoft-com:vml" xmlns:wp14="http://schemas.microsoft.com/office/word/2010/wordprocessingDrawing" xmlns:wp="http://schemas.openxmlformats.org/drawingml/2006/wordprocessingDrawing" xmlns:w10="urn:schemas-microsoft-com:office:word" xmlns:w="http://schemas.openxmlformats.org/wordprocessingml/2006/main" xmlns:w14="http://schemas.microsoft.com/office/word/2010/wordml" xmlns:w15="http://schemas.microsoft.com/office/word/2012/wordml" xmlns:w16cex="http://schemas.microsoft.com/office/word/2018/wordml/cex" xmlns:w16cid="http://schemas.microsoft.com/office/word/2016/wordml/cid" xmlns:w16="http://schemas.microsoft.com/office/word/2018/wordml" xmlns:w16du="http://schemas.microsoft.com/office/word/2023/wordml/word16du" xmlns:w16sdtdh="http://schemas.microsoft.com/office/word/2020/wordml/sdtdatahash" xmlns:w16sdtfl="http://schemas.microsoft.com/office/word/2024/wordml/sdtformatlock" xmlns:w16se="http://schemas.microsoft.com/office/word/2015/wordml/symex" xmlns:wpg="http://schemas.microsoft.com/office/word/2010/wordprocessingGroup" xmlns:wpi="http://schemas.microsoft.com/office/word/2010/wordprocessingInk" xmlns:wne="http://schemas.microsoft.com/office/word/2006/wordml" xmlns:wps="http://schemas.microsoft.com/office/word/2010/wordprocessingShape" mc:Ignorable="w14 w15 w16se w16cid w16 w16cex w16sdtdh w16sdtfl w16du wp14">
+  <w:endnote w:type="separator" w:id="-1">
+    <w:p>
+      <w:pPr>
+        <w:spacing w:after="0" w:line="240" w:lineRule="auto"/>
+      </w:pPr>
+      <w:r>
+        <w:separator/>
+      </w:r>
+    </w:p>
+  </w:endnote>
+  <w:endnote w:type="continuationSeparator" w:id="0">
+    <w:p>
+      <w:pPr>
+        <w:spacing w:after="0" w:line="240" w:lineRule="auto"/>
+      </w:pPr>
+      <w:r>
+        <w:continuationSeparator/>
+      </w:r>
+    </w:p>
+  </w:endnote>
+</w:endnotes>
+</file>
+
+<file path=word/footnotes.xml><?xml version="1.0" encoding="utf-8"?>
+<w:footnotes xmlns:wpc="http://schemas.microsoft.com/office/word/2010/wordprocessingCanvas" xmlns:cx="http://schemas.microsoft.com/office/drawing/2014/chartex" xmlns:cx1="http://schemas.microsoft.com/office/drawing/2015/9/8/chartex" xmlns:cx2="http://schemas.microsoft.com/office/drawing/2015/10/21/chartex" xmlns:cx3="http://schemas.microsoft.com/office/drawing/2016/5/9/chartex" xmlns:cx4="http://schemas.microsoft.com/office/drawing/2016/5/10/chartex" xmlns:cx5="http://schemas.microsoft.com/office/drawing/2016/5/11/chartex" xmlns:cx6="http://schemas.microsoft.com/office/drawing/2016/5/12/chartex" xmlns:cx7="http://schemas.microsoft.com/office/drawing/2016/5/13/chartex" xmlns:cx8="http://schemas.microsoft.com/office/drawing/2016/5/14/chartex" xmlns:mc="http://schemas.openxmlformats.org/markup-compatibility/2006" xmlns:aink="http://schemas.microsoft.com/office/drawing/2016/ink" xmlns:am3d="http://schemas.microsoft.com/office/drawing/2017/model3d" xmlns:o="urn:schemas-microsoft-com:office:office" xmlns:oel="http://schemas.microsoft.com/office/2019/extlst" xmlns:r="http://schemas.openxmlformats.org/officeDocument/2006/relationships" xmlns:m="http://schemas.openxmlformats.org/officeDocument/2006/math" xmlns:v="urn:schemas-microsoft-com:vml" xmlns:wp14="http://schemas.microsoft.com/office/word/2010/wordprocessingDrawing" xmlns:wp="http://schemas.openxmlformats.org/drawingml/2006/wordprocessingDrawing" xmlns:w10="urn:schemas-microsoft-com:office:word" xmlns:w="http://schemas.openxmlformats.org/wordprocessingml/2006/main" xmlns:w14="http://schemas.microsoft.com/office/word/2010/wordml" xmlns:w15="http://schemas.microsoft.com/office/word/2012/wordml" xmlns:w16cex="http://schemas.microsoft.com/office/word/2018/wordml/cex" xmlns:w16cid="http://schemas.microsoft.com/office/word/2016/wordml/cid" xmlns:w16="http://schemas.microsoft.com/office/word/2018/wordml" xmlns:w16du="http://schemas.microsoft.com/office/word/2023/wordml/word16du" xmlns:w16sdtdh="http://schemas.microsoft.com/office/word/2020/wordml/sdtdatahash" xmlns:w16sdtfl="http://schemas.microsoft.com/office/word/2024/wordml/sdtformatlock" xmlns:w16se="http://schemas.microsoft.com/office/word/2015/wordml/symex" xmlns:wpg="http://schemas.microsoft.com/office/word/2010/wordprocessingGroup" xmlns:wpi="http://schemas.microsoft.com/office/word/2010/wordprocessingInk" xmlns:wne="http://schemas.microsoft.com/office/word/2006/wordml" xmlns:wps="http://schemas.microsoft.com/office/word/2010/wordprocessingShape" mc:Ignorable="w14 w15 w16se w16cid w16 w16cex w16sdtdh w16sdtfl w16du wp14">
+  <w:footnote w:type="separator" w:id="-1">
+    <w:p>
+      <w:pPr>
+        <w:spacing w:after="0" w:line="240" w:lineRule="auto"/>
+      </w:pPr>
+      <w:r>
+        <w:separator/>
+      </w:r>
+    </w:p>
+  </w:footnote>
+  <w:footnote w:type="continuationSeparator" w:id="0">
+    <w:p>
+      <w:pPr>
+        <w:spacing w:after="0" w:line="240" w:lineRule="auto"/>
+      </w:pPr>
+      <w:r>
+        <w:continuationSeparator/>
+      </w:r>
+    </w:p>
+  </w:footnote>
+</w:footnotes>
 </file>
 
 <file path=word/styles.xml><?xml version="1.0" encoding="utf-8"?>
@@ -5517,6 +7030,50 @@
       <w:spacing w:val="5"/>
     </w:rPr>
   </w:style>
+  <w:style w:type="paragraph" w:styleId="ae">
+    <w:name w:val="header"/>
+    <w:basedOn w:val="a"/>
+    <w:link w:val="af"/>
+    <w:uiPriority w:val="99"/>
+    <w:unhideWhenUsed/>
+    <w:rsid w:val="00EE1181"/>
+    <w:pPr>
+      <w:tabs>
+        <w:tab w:val="center" w:pos="4153"/>
+        <w:tab w:val="right" w:pos="8306"/>
+      </w:tabs>
+      <w:spacing w:after="0" w:line="240" w:lineRule="auto"/>
+    </w:pPr>
+  </w:style>
+  <w:style w:type="character" w:customStyle="1" w:styleId="af">
+    <w:name w:val="页眉 字符"/>
+    <w:basedOn w:val="a0"/>
+    <w:link w:val="ae"/>
+    <w:uiPriority w:val="99"/>
+    <w:rsid w:val="00EE1181"/>
+  </w:style>
+  <w:style w:type="paragraph" w:styleId="af0">
+    <w:name w:val="footer"/>
+    <w:basedOn w:val="a"/>
+    <w:link w:val="af1"/>
+    <w:uiPriority w:val="99"/>
+    <w:unhideWhenUsed/>
+    <w:rsid w:val="00EE1181"/>
+    <w:pPr>
+      <w:tabs>
+        <w:tab w:val="center" w:pos="4153"/>
+        <w:tab w:val="right" w:pos="8306"/>
+      </w:tabs>
+      <w:spacing w:after="0" w:line="240" w:lineRule="auto"/>
+    </w:pPr>
+  </w:style>
+  <w:style w:type="character" w:customStyle="1" w:styleId="af1">
+    <w:name w:val="页脚 字符"/>
+    <w:basedOn w:val="a0"/>
+    <w:link w:val="af0"/>
+    <w:uiPriority w:val="99"/>
+    <w:rsid w:val="00EE1181"/>
+  </w:style>
 </w:styles>
 </file>
 

</xml_diff>